<commit_message>
Verifica na planta os pontos da análise de impacto do layout
Mantém o texto revisado e acrescenta a seção 6 com o status de cada
ponto (confirmado, parcial ou não verificável), correções sugeridas
e trechos ampliados da planta como evidência.

Co-Authored-By: Claude Opus 5.5 <noreply@anthropic.com>
Claude-Session: https://claude.ai/code/session_01VH5DHRWGjgZCrRg53kmxYL
</commit_message>
<xml_diff>
--- a/docs/Analise_Impacto_Layout_UBP_SFI.docx
+++ b/docs/Analise_Impacto_Layout_UBP_SFI.docx
@@ -59,18 +59,12 @@
         <w:spacing w:after="120"/>
       </w:pPr>
       <w:r>
-        <w:rPr>
-          <w:b/>
-          <w:bCs/>
-        </w:rPr>
-        <w:t xml:space="preserve">Observação: </w:t>
-      </w:r>
-      <w:r>
-        <w:t xml:space="preserve">não havia versão anterior do projeto disponível para comparação. Esta análise se baseia nas áreas marcadas em vermelho e no texto da apresentação.</w:t>
-      </w:r>
-    </w:p>
-    <w:p>
-      <w:pPr>
+        <w:t xml:space="preserve">Cada ponto deste documento foi conferido nas plantas da apresentação; o resultado está na seção 6.</w:t>
+      </w:r>
+    </w:p>
+    <w:p>
+      <w:pPr>
+        <w:keepNext/>
         <w:jc w:val="center"/>
       </w:pPr>
       <w:r>
@@ -304,8 +298,6 @@
           <w:p>
             <w:r>
               <w:rPr>
-                <w:b w:val="false"/>
-                <w:bCs w:val="false"/>
                 <w:sz w:val="19"/>
                 <w:szCs w:val="19"/>
               </w:rPr>
@@ -332,8 +324,6 @@
           <w:p>
             <w:r>
               <w:rPr>
-                <w:b w:val="false"/>
-                <w:bCs w:val="false"/>
                 <w:sz w:val="19"/>
                 <w:szCs w:val="19"/>
               </w:rPr>
@@ -360,12 +350,10 @@
           <w:p>
             <w:r>
               <w:rPr>
-                <w:b w:val="false"/>
-                <w:bCs w:val="false"/>
-                <w:sz w:val="19"/>
-                <w:szCs w:val="19"/>
-              </w:rPr>
-              <w:t xml:space="preserve">Acréscimo de faixa de 3 m além do "limite do terreno sem área alagada", com muro de contenção e pavimentação. Parte da escada dos fundos e da circulação de pessoas passa a ficar nessa faixa.</w:t>
+                <w:sz w:val="19"/>
+                <w:szCs w:val="19"/>
+              </w:rPr>
+              <w:t xml:space="preserve">Acréscimo de faixa de 3 m além do "limite do terreno sem área alagada", com muro de contenção e pavimentação. Parte da escada dos fundos e da circulação de pessoas pode ficar nessa faixa.</w:t>
             </w:r>
           </w:p>
         </w:tc>
@@ -388,12 +376,10 @@
           <w:p>
             <w:r>
               <w:rPr>
-                <w:b/>
-                <w:bCs/>
-                <w:sz w:val="19"/>
-                <w:szCs w:val="19"/>
-              </w:rPr>
-              <w:t xml:space="preserve">MAIS CRÍTICO. A obra avança sobre a área alagada e exige muro de contenção, aterro e fundações.</w:t>
+                <w:sz w:val="19"/>
+                <w:szCs w:val="19"/>
+              </w:rPr>
+              <w:t xml:space="preserve">MAIS CRÍTICO. A obra pode avançar sobre a área alagada e exigir muro de contenção, aterro e fundações. Verificar.</w:t>
             </w:r>
           </w:p>
         </w:tc>
@@ -421,8 +407,6 @@
           <w:p>
             <w:r>
               <w:rPr>
-                <w:b w:val="false"/>
-                <w:bCs w:val="false"/>
                 <w:sz w:val="19"/>
                 <w:szCs w:val="19"/>
               </w:rPr>
@@ -449,8 +433,6 @@
           <w:p>
             <w:r>
               <w:rPr>
-                <w:b w:val="false"/>
-                <w:bCs w:val="false"/>
                 <w:sz w:val="19"/>
                 <w:szCs w:val="19"/>
               </w:rPr>
@@ -477,8 +459,6 @@
           <w:p>
             <w:r>
               <w:rPr>
-                <w:b w:val="false"/>
-                <w:bCs w:val="false"/>
                 <w:sz w:val="19"/>
                 <w:szCs w:val="19"/>
               </w:rPr>
@@ -505,12 +485,10 @@
           <w:p>
             <w:r>
               <w:rPr>
-                <w:b w:val="false"/>
-                <w:bCs w:val="false"/>
-                <w:sz w:val="19"/>
-                <w:szCs w:val="19"/>
-              </w:rPr>
-              <w:t xml:space="preserve">Refazer implantação e fachada frontal; controle de acesso muda.</w:t>
+                <w:sz w:val="19"/>
+                <w:szCs w:val="19"/>
+              </w:rPr>
+              <w:t xml:space="preserve">Refazer implantação e fachada frontal; controle de acesso muda. Ok.</w:t>
             </w:r>
           </w:p>
         </w:tc>
@@ -538,8 +516,6 @@
           <w:p>
             <w:r>
               <w:rPr>
-                <w:b w:val="false"/>
-                <w:bCs w:val="false"/>
                 <w:sz w:val="19"/>
                 <w:szCs w:val="19"/>
               </w:rPr>
@@ -566,8 +542,6 @@
           <w:p>
             <w:r>
               <w:rPr>
-                <w:b w:val="false"/>
-                <w:bCs w:val="false"/>
                 <w:sz w:val="19"/>
                 <w:szCs w:val="19"/>
               </w:rPr>
@@ -594,8 +568,6 @@
           <w:p>
             <w:r>
               <w:rPr>
-                <w:b w:val="false"/>
-                <w:bCs w:val="false"/>
                 <w:sz w:val="19"/>
                 <w:szCs w:val="19"/>
               </w:rPr>
@@ -622,12 +594,10 @@
           <w:p>
             <w:r>
               <w:rPr>
-                <w:b w:val="false"/>
-                <w:bCs w:val="false"/>
-                <w:sz w:val="19"/>
-                <w:szCs w:val="19"/>
-              </w:rPr>
-              <w:t xml:space="preserve">Mudam controle de acesso e tratamento acústico; separar área pública da área industrial.</w:t>
+                <w:sz w:val="19"/>
+                <w:szCs w:val="19"/>
+              </w:rPr>
+              <w:t xml:space="preserve">Mudam controle de acesso e tratamento acústico; separar área pública da área industrial. Ok.</w:t>
             </w:r>
           </w:p>
         </w:tc>
@@ -655,8 +625,6 @@
           <w:p>
             <w:r>
               <w:rPr>
-                <w:b w:val="false"/>
-                <w:bCs w:val="false"/>
                 <w:sz w:val="19"/>
                 <w:szCs w:val="19"/>
               </w:rPr>
@@ -683,8 +651,6 @@
           <w:p>
             <w:r>
               <w:rPr>
-                <w:b w:val="false"/>
-                <w:bCs w:val="false"/>
                 <w:sz w:val="19"/>
                 <w:szCs w:val="19"/>
               </w:rPr>
@@ -711,8 +677,6 @@
           <w:p>
             <w:r>
               <w:rPr>
-                <w:b w:val="false"/>
-                <w:bCs w:val="false"/>
                 <w:sz w:val="19"/>
                 <w:szCs w:val="19"/>
               </w:rPr>
@@ -739,12 +703,10 @@
           <w:p>
             <w:r>
               <w:rPr>
-                <w:b w:val="false"/>
-                <w:bCs w:val="false"/>
-                <w:sz w:val="19"/>
-                <w:szCs w:val="19"/>
-              </w:rPr>
-              <w:t xml:space="preserve">Baixo impacto, mas aumenta a área impermeável.</w:t>
+                <w:sz w:val="19"/>
+                <w:szCs w:val="19"/>
+              </w:rPr>
+              <w:t xml:space="preserve">Baixo impacto, mas aumenta a área impermeável. Ok.</w:t>
             </w:r>
           </w:p>
         </w:tc>
@@ -772,8 +734,6 @@
           <w:p>
             <w:r>
               <w:rPr>
-                <w:b w:val="false"/>
-                <w:bCs w:val="false"/>
                 <w:sz w:val="19"/>
                 <w:szCs w:val="19"/>
               </w:rPr>
@@ -800,8 +760,6 @@
           <w:p>
             <w:r>
               <w:rPr>
-                <w:b w:val="false"/>
-                <w:bCs w:val="false"/>
                 <w:sz w:val="19"/>
                 <w:szCs w:val="19"/>
               </w:rPr>
@@ -828,8 +786,6 @@
           <w:p>
             <w:r>
               <w:rPr>
-                <w:b w:val="false"/>
-                <w:bCs w:val="false"/>
                 <w:sz w:val="19"/>
                 <w:szCs w:val="19"/>
               </w:rPr>
@@ -856,12 +812,10 @@
           <w:p>
             <w:r>
               <w:rPr>
-                <w:b w:val="false"/>
-                <w:bCs w:val="false"/>
-                <w:sz w:val="19"/>
-                <w:szCs w:val="19"/>
-              </w:rPr>
-              <w:t xml:space="preserve">Revisar esquadrias e drenagem. Melhora sanitária (sala deixa de abrir para a ETE).</w:t>
+                <w:sz w:val="19"/>
+                <w:szCs w:val="19"/>
+              </w:rPr>
+              <w:t xml:space="preserve">Revisar esquadrias e drenagem. Melhora sanitária (sala deixa de abrir para a ETE, pelo que entendi).</w:t>
             </w:r>
           </w:p>
         </w:tc>
@@ -892,7 +846,7 @@
         <w:t xml:space="preserve">Arquitetura e implantação: </w:t>
       </w:r>
       <w:r>
-        <w:t xml:space="preserve">revisar planta de situação, implantação, fachada frontal e quadro de esquadrias. Recalcular a taxa de ocupação e, principalmente, a taxa de permeabilidade, que cai com as quatro novas áreas pavimentadas e pode esbarrar em outro parâmetro municipal.</w:t>
+        <w:t xml:space="preserve">revisar planta de situação, implantação, fachada frontal e quadro de esquadrias.</w:t>
       </w:r>
     </w:p>
     <w:p>
@@ -912,7 +866,7 @@
         <w:t xml:space="preserve">Estrutura e geotecnia: </w:t>
       </w:r>
       <w:r>
-        <w:t xml:space="preserve">muro de contenção nos fundos e fundações da faixa que avança sobre a área alagada exigem sondagem e projeto próprio.</w:t>
+        <w:t xml:space="preserve">muro de contenção nos fundos e fundações da faixa que pode avançar sobre a área alagada exigem sondagem e projeto próprio.</w:t>
       </w:r>
     </w:p>
     <w:p>
@@ -1077,10 +1031,10 @@
           <w:b/>
           <w:bCs/>
         </w:rPr>
-        <w:t xml:space="preserve">Área alagada: </w:t>
-      </w:r>
-      <w:r>
-        <w:t xml:space="preserve">há restrição ambiental (APP ou área úmida)? A intervenção pode depender de licença do INEA ou da Prefeitura.</w:t>
+        <w:t xml:space="preserve">Permeabilidade: </w:t>
+      </w:r>
+      <w:r>
+        <w:t xml:space="preserve">as novas áreas pavimentadas continuam dentro da taxa de permeabilidade mínima?</w:t>
       </w:r>
     </w:p>
     <w:p>
@@ -1097,46 +1051,2152 @@
           <w:b/>
           <w:bCs/>
         </w:rPr>
-        <w:t xml:space="preserve">Permeabilidade: </w:t>
-      </w:r>
-      <w:r>
-        <w:t xml:space="preserve">as novas áreas pavimentadas continuam dentro da taxa de permeabilidade mínima?</w:t>
-      </w:r>
-    </w:p>
-    <w:p>
-      <w:pPr>
-        <w:pStyle w:val="ListParagraph"/>
-        <w:numPr>
-          <w:ilvl w:val="0"/>
-          <w:numId w:val="3"/>
-        </w:numPr>
-        <w:spacing w:after="80"/>
+        <w:t xml:space="preserve">Subestação: </w:t>
+      </w:r>
+      <w:r>
+        <w:t xml:space="preserve">como fica o acesso da concessionária?</w:t>
+      </w:r>
+    </w:p>
+    <w:p>
+      <w:pPr>
+        <w:pStyle w:val="Heading1"/>
+      </w:pPr>
+      <w:r>
+        <w:t xml:space="preserve">5. Limitações e próximos passos</w:t>
+      </w:r>
+    </w:p>
+    <w:p>
+      <w:pPr>
+        <w:spacing w:after="120"/>
+      </w:pPr>
+      <w:r>
+        <w:t xml:space="preserve">A apresentação traz apenas a cota de 3,00 m; não foi possível medir as áreas acrescidas. Para quantificar as alterações são necessárias as plantas em DWG ou PDF com escala. Com o layout anterior, é possível fazer uma comparação ponto a ponto.</w:t>
+      </w:r>
+    </w:p>
+    <w:p>
+      <w:pPr>
+        <w:pStyle w:val="Heading1"/>
+      </w:pPr>
+      <w:r>
+        <w:t xml:space="preserve">6. Verificação na planta</w:t>
+      </w:r>
+    </w:p>
+    <w:p>
+      <w:pPr>
+        <w:spacing w:after="120"/>
       </w:pPr>
       <w:r>
         <w:rPr>
           <w:b/>
           <w:bCs/>
         </w:rPr>
-        <w:t xml:space="preserve">Subestação: </w:t>
-      </w:r>
-      <w:r>
-        <w:t xml:space="preserve">como fica o acesso da concessionária?</w:t>
-      </w:r>
-    </w:p>
-    <w:p>
-      <w:pPr>
-        <w:pStyle w:val="Heading1"/>
-      </w:pPr>
-      <w:r>
-        <w:t xml:space="preserve">5. Limitações e próximos passos</w:t>
-      </w:r>
-    </w:p>
-    <w:p>
-      <w:pPr>
-        <w:spacing w:after="120"/>
-      </w:pPr>
-      <w:r>
-        <w:t xml:space="preserve">A apresentação traz apenas a cota de 3,00 m; não foi possível medir as áreas acrescidas. Para quantificar as alterações são necessárias as plantas em DWG ou PDF com escala. Com o layout anterior, é possível fazer uma comparação ponto a ponto.</w:t>
+        <w:t xml:space="preserve">Critério: </w:t>
+      </w:r>
+      <w:r>
+        <w:t xml:space="preserve">Confirmado = o ponto aparece na planta ou no texto dos slides. Parcial = parte aparece e parte é dedução ou está diferente. Não verificável = a apresentação não traz informação suficiente.</w:t>
+      </w:r>
+    </w:p>
+    <w:p>
+      <w:pPr>
+        <w:pStyle w:val="Heading2"/>
+      </w:pPr>
+      <w:r>
+        <w:t xml:space="preserve">6.1 Alterações identificadas (seção 2)</w:t>
+      </w:r>
+    </w:p>
+    <w:tbl>
+      <w:tblPr>
+        <w:tblW w:type="dxa" w:w="9026"/>
+        <w:tblBorders>
+          <w:top w:val="single" w:color="auto" w:sz="4"/>
+          <w:left w:val="single" w:color="auto" w:sz="4"/>
+          <w:bottom w:val="single" w:color="auto" w:sz="4"/>
+          <w:right w:val="single" w:color="auto" w:sz="4"/>
+          <w:insideH w:val="single" w:color="auto" w:sz="4"/>
+          <w:insideV w:val="single" w:color="auto" w:sz="4"/>
+        </w:tblBorders>
+      </w:tblPr>
+      <w:tblGrid>
+        <w:gridCol w:w="500"/>
+        <w:gridCol w:w="1500"/>
+        <w:gridCol w:w="7026"/>
+      </w:tblGrid>
+      <w:tr>
+        <w:trPr>
+          <w:tblHeader/>
+        </w:trPr>
+        <w:tc>
+          <w:tcPr>
+            <w:tcW w:type="dxa" w:w="500"/>
+            <w:tcBorders>
+              <w:top w:val="single" w:color="BFBFBF" w:sz="4"/>
+              <w:left w:val="single" w:color="BFBFBF" w:sz="4"/>
+              <w:bottom w:val="single" w:color="BFBFBF" w:sz="4"/>
+              <w:right w:val="single" w:color="BFBFBF" w:sz="4"/>
+            </w:tcBorders>
+            <w:shd w:fill="00843D" w:color="auto" w:val="clear"/>
+            <w:tcMar>
+              <w:top w:type="dxa" w:w="60"/>
+              <w:left w:type="dxa" w:w="100"/>
+              <w:bottom w:type="dxa" w:w="60"/>
+              <w:right w:type="dxa" w:w="100"/>
+            </w:tcMar>
+          </w:tcPr>
+          <w:p>
+            <w:r>
+              <w:rPr>
+                <w:b/>
+                <w:bCs/>
+                <w:color w:val="FFFFFF"/>
+                <w:sz w:val="19"/>
+                <w:szCs w:val="19"/>
+              </w:rPr>
+              <w:t xml:space="preserve">#</w:t>
+            </w:r>
+          </w:p>
+        </w:tc>
+        <w:tc>
+          <w:tcPr>
+            <w:tcW w:type="dxa" w:w="1500"/>
+            <w:tcBorders>
+              <w:top w:val="single" w:color="BFBFBF" w:sz="4"/>
+              <w:left w:val="single" w:color="BFBFBF" w:sz="4"/>
+              <w:bottom w:val="single" w:color="BFBFBF" w:sz="4"/>
+              <w:right w:val="single" w:color="BFBFBF" w:sz="4"/>
+            </w:tcBorders>
+            <w:shd w:fill="00843D" w:color="auto" w:val="clear"/>
+            <w:tcMar>
+              <w:top w:type="dxa" w:w="60"/>
+              <w:left w:type="dxa" w:w="100"/>
+              <w:bottom w:type="dxa" w:w="60"/>
+              <w:right w:type="dxa" w:w="100"/>
+            </w:tcMar>
+          </w:tcPr>
+          <w:p>
+            <w:r>
+              <w:rPr>
+                <w:b/>
+                <w:bCs/>
+                <w:color w:val="FFFFFF"/>
+                <w:sz w:val="19"/>
+                <w:szCs w:val="19"/>
+              </w:rPr>
+              <w:t xml:space="preserve">Status</w:t>
+            </w:r>
+          </w:p>
+        </w:tc>
+        <w:tc>
+          <w:tcPr>
+            <w:tcW w:type="dxa" w:w="7026"/>
+            <w:tcBorders>
+              <w:top w:val="single" w:color="BFBFBF" w:sz="4"/>
+              <w:left w:val="single" w:color="BFBFBF" w:sz="4"/>
+              <w:bottom w:val="single" w:color="BFBFBF" w:sz="4"/>
+              <w:right w:val="single" w:color="BFBFBF" w:sz="4"/>
+            </w:tcBorders>
+            <w:shd w:fill="00843D" w:color="auto" w:val="clear"/>
+            <w:tcMar>
+              <w:top w:type="dxa" w:w="60"/>
+              <w:left w:type="dxa" w:w="100"/>
+              <w:bottom w:type="dxa" w:w="60"/>
+              <w:right w:type="dxa" w:w="100"/>
+            </w:tcMar>
+          </w:tcPr>
+          <w:p>
+            <w:r>
+              <w:rPr>
+                <w:b/>
+                <w:bCs/>
+                <w:color w:val="FFFFFF"/>
+                <w:sz w:val="19"/>
+                <w:szCs w:val="19"/>
+              </w:rPr>
+              <w:t xml:space="preserve">O que a planta mostra</w:t>
+            </w:r>
+          </w:p>
+        </w:tc>
+      </w:tr>
+      <w:tr>
+        <w:trPr>
+          <w:tblHeader w:val="false"/>
+        </w:trPr>
+        <w:tc>
+          <w:tcPr>
+            <w:tcW w:type="dxa" w:w="500"/>
+            <w:tcBorders>
+              <w:top w:val="single" w:color="BFBFBF" w:sz="4"/>
+              <w:left w:val="single" w:color="BFBFBF" w:sz="4"/>
+              <w:bottom w:val="single" w:color="BFBFBF" w:sz="4"/>
+              <w:right w:val="single" w:color="BFBFBF" w:sz="4"/>
+            </w:tcBorders>
+            <w:tcMar>
+              <w:top w:type="dxa" w:w="60"/>
+              <w:left w:type="dxa" w:w="100"/>
+              <w:bottom w:type="dxa" w:w="60"/>
+              <w:right w:type="dxa" w:w="100"/>
+            </w:tcMar>
+          </w:tcPr>
+          <w:p>
+            <w:r>
+              <w:rPr>
+                <w:sz w:val="19"/>
+                <w:szCs w:val="19"/>
+              </w:rPr>
+              <w:t xml:space="preserve">1</w:t>
+            </w:r>
+          </w:p>
+        </w:tc>
+        <w:tc>
+          <w:tcPr>
+            <w:tcW w:type="dxa" w:w="1500"/>
+            <w:tcBorders>
+              <w:top w:val="single" w:color="BFBFBF" w:sz="4"/>
+              <w:left w:val="single" w:color="BFBFBF" w:sz="4"/>
+              <w:bottom w:val="single" w:color="BFBFBF" w:sz="4"/>
+              <w:right w:val="single" w:color="BFBFBF" w:sz="4"/>
+            </w:tcBorders>
+            <w:shd w:fill="FFF2CC" w:color="auto" w:val="clear"/>
+            <w:tcMar>
+              <w:top w:type="dxa" w:w="60"/>
+              <w:left w:type="dxa" w:w="100"/>
+              <w:bottom w:type="dxa" w:w="60"/>
+              <w:right w:type="dxa" w:w="100"/>
+            </w:tcMar>
+          </w:tcPr>
+          <w:p>
+            <w:r>
+              <w:rPr>
+                <w:b/>
+                <w:bCs/>
+                <w:sz w:val="19"/>
+                <w:szCs w:val="19"/>
+              </w:rPr>
+              <w:t xml:space="preserve">Parcial</w:t>
+            </w:r>
+          </w:p>
+        </w:tc>
+        <w:tc>
+          <w:tcPr>
+            <w:tcW w:type="dxa" w:w="7026"/>
+            <w:tcBorders>
+              <w:top w:val="single" w:color="BFBFBF" w:sz="4"/>
+              <w:left w:val="single" w:color="BFBFBF" w:sz="4"/>
+              <w:bottom w:val="single" w:color="BFBFBF" w:sz="4"/>
+              <w:right w:val="single" w:color="BFBFBF" w:sz="4"/>
+            </w:tcBorders>
+            <w:tcMar>
+              <w:top w:type="dxa" w:w="60"/>
+              <w:left w:type="dxa" w:w="100"/>
+              <w:bottom w:type="dxa" w:w="60"/>
+              <w:right w:type="dxa" w:w="100"/>
+            </w:tcMar>
+          </w:tcPr>
+          <w:p>
+            <w:r>
+              <w:rPr>
+                <w:sz w:val="19"/>
+                <w:szCs w:val="19"/>
+              </w:rPr>
+              <w:t xml:space="preserve">CONFIRMADO: faixa em vermelho além do "limite do terreno sem área alagada", com muro de contenção e pavimentação (texto do slide 3); dentro dela ficam a escada externa, o patamar e duas portas de saída dos fundos. DIFERENTE DO TEXTO: a parede dos fundos da edificação fica exatamente sobre o limite; só escada e patamar entram na faixa, o prédio em si não. NÃO CONSTA: aterro (é dedução a partir do muro de contenção). Há uma linha amarela sem legenda nessa região.</w:t>
+            </w:r>
+          </w:p>
+        </w:tc>
+      </w:tr>
+      <w:tr>
+        <w:trPr>
+          <w:tblHeader w:val="false"/>
+        </w:trPr>
+        <w:tc>
+          <w:tcPr>
+            <w:tcW w:type="dxa" w:w="500"/>
+            <w:tcBorders>
+              <w:top w:val="single" w:color="BFBFBF" w:sz="4"/>
+              <w:left w:val="single" w:color="BFBFBF" w:sz="4"/>
+              <w:bottom w:val="single" w:color="BFBFBF" w:sz="4"/>
+              <w:right w:val="single" w:color="BFBFBF" w:sz="4"/>
+            </w:tcBorders>
+            <w:tcMar>
+              <w:top w:type="dxa" w:w="60"/>
+              <w:left w:type="dxa" w:w="100"/>
+              <w:bottom w:type="dxa" w:w="60"/>
+              <w:right w:type="dxa" w:w="100"/>
+            </w:tcMar>
+          </w:tcPr>
+          <w:p>
+            <w:r>
+              <w:rPr>
+                <w:sz w:val="19"/>
+                <w:szCs w:val="19"/>
+              </w:rPr>
+              <w:t xml:space="preserve">2</w:t>
+            </w:r>
+          </w:p>
+        </w:tc>
+        <w:tc>
+          <w:tcPr>
+            <w:tcW w:type="dxa" w:w="1500"/>
+            <w:tcBorders>
+              <w:top w:val="single" w:color="BFBFBF" w:sz="4"/>
+              <w:left w:val="single" w:color="BFBFBF" w:sz="4"/>
+              <w:bottom w:val="single" w:color="BFBFBF" w:sz="4"/>
+              <w:right w:val="single" w:color="BFBFBF" w:sz="4"/>
+            </w:tcBorders>
+            <w:shd w:fill="FFF2CC" w:color="auto" w:val="clear"/>
+            <w:tcMar>
+              <w:top w:type="dxa" w:w="60"/>
+              <w:left w:type="dxa" w:w="100"/>
+              <w:bottom w:type="dxa" w:w="60"/>
+              <w:right w:type="dxa" w:w="100"/>
+            </w:tcMar>
+          </w:tcPr>
+          <w:p>
+            <w:r>
+              <w:rPr>
+                <w:b/>
+                <w:bCs/>
+                <w:sz w:val="19"/>
+                <w:szCs w:val="19"/>
+              </w:rPr>
+              <w:t xml:space="preserve">Parcial</w:t>
+            </w:r>
+          </w:p>
+        </w:tc>
+        <w:tc>
+          <w:tcPr>
+            <w:tcW w:type="dxa" w:w="7026"/>
+            <w:tcBorders>
+              <w:top w:val="single" w:color="BFBFBF" w:sz="4"/>
+              <w:left w:val="single" w:color="BFBFBF" w:sz="4"/>
+              <w:bottom w:val="single" w:color="BFBFBF" w:sz="4"/>
+              <w:right w:val="single" w:color="BFBFBF" w:sz="4"/>
+            </w:tcBorders>
+            <w:tcMar>
+              <w:top w:type="dxa" w:w="60"/>
+              <w:left w:type="dxa" w:w="100"/>
+              <w:bottom w:type="dxa" w:w="60"/>
+              <w:right w:type="dxa" w:w="100"/>
+            </w:tcMar>
+          </w:tcPr>
+          <w:p>
+            <w:r>
+              <w:rPr>
+                <w:sz w:val="19"/>
+                <w:szCs w:val="19"/>
+              </w:rPr>
+              <w:t xml:space="preserve">CONFIRMADO: cota "AFASTAMENTO 3,00 m" alinhada à face de Loja, WC, Guarita, Gerador e Subestação. NÃO CONSTA: pavimentação e drenagem da faixa frontal. O slide 5 diz só "adequações provenientes do recuo frontal"; pavimentação e drenagem são citadas apenas para as áreas descobertas.</w:t>
+            </w:r>
+          </w:p>
+        </w:tc>
+      </w:tr>
+      <w:tr>
+        <w:trPr>
+          <w:tblHeader w:val="false"/>
+        </w:trPr>
+        <w:tc>
+          <w:tcPr>
+            <w:tcW w:type="dxa" w:w="500"/>
+            <w:tcBorders>
+              <w:top w:val="single" w:color="BFBFBF" w:sz="4"/>
+              <w:left w:val="single" w:color="BFBFBF" w:sz="4"/>
+              <w:bottom w:val="single" w:color="BFBFBF" w:sz="4"/>
+              <w:right w:val="single" w:color="BFBFBF" w:sz="4"/>
+            </w:tcBorders>
+            <w:tcMar>
+              <w:top w:type="dxa" w:w="60"/>
+              <w:left w:type="dxa" w:w="100"/>
+              <w:bottom w:type="dxa" w:w="60"/>
+              <w:right w:type="dxa" w:w="100"/>
+            </w:tcMar>
+          </w:tcPr>
+          <w:p>
+            <w:r>
+              <w:rPr>
+                <w:sz w:val="19"/>
+                <w:szCs w:val="19"/>
+              </w:rPr>
+              <w:t xml:space="preserve">3</w:t>
+            </w:r>
+          </w:p>
+        </w:tc>
+        <w:tc>
+          <w:tcPr>
+            <w:tcW w:type="dxa" w:w="1500"/>
+            <w:tcBorders>
+              <w:top w:val="single" w:color="BFBFBF" w:sz="4"/>
+              <w:left w:val="single" w:color="BFBFBF" w:sz="4"/>
+              <w:bottom w:val="single" w:color="BFBFBF" w:sz="4"/>
+              <w:right w:val="single" w:color="BFBFBF" w:sz="4"/>
+            </w:tcBorders>
+            <w:shd w:fill="D9EAD3" w:color="auto" w:val="clear"/>
+            <w:tcMar>
+              <w:top w:type="dxa" w:w="60"/>
+              <w:left w:type="dxa" w:w="100"/>
+              <w:bottom w:type="dxa" w:w="60"/>
+              <w:right w:type="dxa" w:w="100"/>
+            </w:tcMar>
+          </w:tcPr>
+          <w:p>
+            <w:r>
+              <w:rPr>
+                <w:b/>
+                <w:bCs/>
+                <w:sz w:val="19"/>
+                <w:szCs w:val="19"/>
+              </w:rPr>
+              <w:t xml:space="preserve">Confirmado</w:t>
+            </w:r>
+          </w:p>
+        </w:tc>
+        <w:tc>
+          <w:tcPr>
+            <w:tcW w:type="dxa" w:w="7026"/>
+            <w:tcBorders>
+              <w:top w:val="single" w:color="BFBFBF" w:sz="4"/>
+              <w:left w:val="single" w:color="BFBFBF" w:sz="4"/>
+              <w:bottom w:val="single" w:color="BFBFBF" w:sz="4"/>
+              <w:right w:val="single" w:color="BFBFBF" w:sz="4"/>
+            </w:tcBorders>
+            <w:tcMar>
+              <w:top w:type="dxa" w:w="60"/>
+              <w:left w:type="dxa" w:w="100"/>
+              <w:bottom w:type="dxa" w:w="60"/>
+              <w:right w:type="dxa" w:w="100"/>
+            </w:tcMar>
+          </w:tcPr>
+          <w:p>
+            <w:r>
+              <w:rPr>
+                <w:sz w:val="19"/>
+                <w:szCs w:val="19"/>
+              </w:rPr>
+              <w:t xml:space="preserve">Grade em vermelho sai da lateral da loja até a divisa e segue pela divisa até a academia urbana, com portão de pedestres (folha com giro) e fechamento no acesso de veículos (portão largo na fachada). Muro acústico na frente do gerador e da subestação, com o letreiro da UBP (slide 7). Loja sem fechamento, com porta abrindo direto para a faixa. Um contorno tracejado vermelho em frente à loja parece ser marquise ou cobertura; confirmar.</w:t>
+            </w:r>
+          </w:p>
+        </w:tc>
+      </w:tr>
+      <w:tr>
+        <w:trPr>
+          <w:tblHeader w:val="false"/>
+        </w:trPr>
+        <w:tc>
+          <w:tcPr>
+            <w:tcW w:type="dxa" w:w="500"/>
+            <w:tcBorders>
+              <w:top w:val="single" w:color="BFBFBF" w:sz="4"/>
+              <w:left w:val="single" w:color="BFBFBF" w:sz="4"/>
+              <w:bottom w:val="single" w:color="BFBFBF" w:sz="4"/>
+              <w:right w:val="single" w:color="BFBFBF" w:sz="4"/>
+            </w:tcBorders>
+            <w:tcMar>
+              <w:top w:type="dxa" w:w="60"/>
+              <w:left w:type="dxa" w:w="100"/>
+              <w:bottom w:type="dxa" w:w="60"/>
+              <w:right w:type="dxa" w:w="100"/>
+            </w:tcMar>
+          </w:tcPr>
+          <w:p>
+            <w:r>
+              <w:rPr>
+                <w:sz w:val="19"/>
+                <w:szCs w:val="19"/>
+              </w:rPr>
+              <w:t xml:space="preserve">4</w:t>
+            </w:r>
+          </w:p>
+        </w:tc>
+        <w:tc>
+          <w:tcPr>
+            <w:tcW w:type="dxa" w:w="1500"/>
+            <w:tcBorders>
+              <w:top w:val="single" w:color="BFBFBF" w:sz="4"/>
+              <w:left w:val="single" w:color="BFBFBF" w:sz="4"/>
+              <w:bottom w:val="single" w:color="BFBFBF" w:sz="4"/>
+              <w:right w:val="single" w:color="BFBFBF" w:sz="4"/>
+            </w:tcBorders>
+            <w:shd w:fill="D9EAD3" w:color="auto" w:val="clear"/>
+            <w:tcMar>
+              <w:top w:type="dxa" w:w="60"/>
+              <w:left w:type="dxa" w:w="100"/>
+              <w:bottom w:type="dxa" w:w="60"/>
+              <w:right w:type="dxa" w:w="100"/>
+            </w:tcMar>
+          </w:tcPr>
+          <w:p>
+            <w:r>
+              <w:rPr>
+                <w:b/>
+                <w:bCs/>
+                <w:sz w:val="19"/>
+                <w:szCs w:val="19"/>
+              </w:rPr>
+              <w:t xml:space="preserve">Confirmado</w:t>
+            </w:r>
+          </w:p>
+        </w:tc>
+        <w:tc>
+          <w:tcPr>
+            <w:tcW w:type="dxa" w:w="7026"/>
+            <w:tcBorders>
+              <w:top w:val="single" w:color="BFBFBF" w:sz="4"/>
+              <w:left w:val="single" w:color="BFBFBF" w:sz="4"/>
+              <w:bottom w:val="single" w:color="BFBFBF" w:sz="4"/>
+              <w:right w:val="single" w:color="BFBFBF" w:sz="4"/>
+            </w:tcBorders>
+            <w:tcMar>
+              <w:top w:type="dxa" w:w="60"/>
+              <w:left w:type="dxa" w:w="100"/>
+              <w:bottom w:type="dxa" w:w="60"/>
+              <w:right w:type="dxa" w:w="100"/>
+            </w:tcMar>
+          </w:tcPr>
+          <w:p>
+            <w:r>
+              <w:rPr>
+                <w:sz w:val="19"/>
+                <w:szCs w:val="19"/>
+              </w:rPr>
+              <w:t xml:space="preserve">Porta nova de duas folhas (em vermelho) do refeitório para a área descoberta. A área é fechada pela divisa com a academia urbana e só tem acesso pelo refeitório. Pavimentação e drenagem citadas no slide 5.</w:t>
+            </w:r>
+          </w:p>
+        </w:tc>
+      </w:tr>
+      <w:tr>
+        <w:trPr>
+          <w:tblHeader w:val="false"/>
+        </w:trPr>
+        <w:tc>
+          <w:tcPr>
+            <w:tcW w:type="dxa" w:w="500"/>
+            <w:tcBorders>
+              <w:top w:val="single" w:color="BFBFBF" w:sz="4"/>
+              <w:left w:val="single" w:color="BFBFBF" w:sz="4"/>
+              <w:bottom w:val="single" w:color="BFBFBF" w:sz="4"/>
+              <w:right w:val="single" w:color="BFBFBF" w:sz="4"/>
+            </w:tcBorders>
+            <w:tcMar>
+              <w:top w:type="dxa" w:w="60"/>
+              <w:left w:type="dxa" w:w="100"/>
+              <w:bottom w:type="dxa" w:w="60"/>
+              <w:right w:type="dxa" w:w="100"/>
+            </w:tcMar>
+          </w:tcPr>
+          <w:p>
+            <w:r>
+              <w:rPr>
+                <w:sz w:val="19"/>
+                <w:szCs w:val="19"/>
+              </w:rPr>
+              <w:t xml:space="preserve">5</w:t>
+            </w:r>
+          </w:p>
+        </w:tc>
+        <w:tc>
+          <w:tcPr>
+            <w:tcW w:type="dxa" w:w="1500"/>
+            <w:tcBorders>
+              <w:top w:val="single" w:color="BFBFBF" w:sz="4"/>
+              <w:left w:val="single" w:color="BFBFBF" w:sz="4"/>
+              <w:bottom w:val="single" w:color="BFBFBF" w:sz="4"/>
+              <w:right w:val="single" w:color="BFBFBF" w:sz="4"/>
+            </w:tcBorders>
+            <w:shd w:fill="FFF2CC" w:color="auto" w:val="clear"/>
+            <w:tcMar>
+              <w:top w:type="dxa" w:w="60"/>
+              <w:left w:type="dxa" w:w="100"/>
+              <w:bottom w:type="dxa" w:w="60"/>
+              <w:right w:type="dxa" w:w="100"/>
+            </w:tcMar>
+          </w:tcPr>
+          <w:p>
+            <w:r>
+              <w:rPr>
+                <w:b/>
+                <w:bCs/>
+                <w:sz w:val="19"/>
+                <w:szCs w:val="19"/>
+              </w:rPr>
+              <w:t xml:space="preserve">Parcial</w:t>
+            </w:r>
+          </w:p>
+        </w:tc>
+        <w:tc>
+          <w:tcPr>
+            <w:tcW w:type="dxa" w:w="7026"/>
+            <w:tcBorders>
+              <w:top w:val="single" w:color="BFBFBF" w:sz="4"/>
+              <w:left w:val="single" w:color="BFBFBF" w:sz="4"/>
+              <w:bottom w:val="single" w:color="BFBFBF" w:sz="4"/>
+              <w:right w:val="single" w:color="BFBFBF" w:sz="4"/>
+            </w:tcBorders>
+            <w:tcMar>
+              <w:top w:type="dxa" w:w="60"/>
+              <w:left w:type="dxa" w:w="100"/>
+              <w:bottom w:type="dxa" w:w="60"/>
+              <w:right w:type="dxa" w:w="100"/>
+            </w:tcMar>
+          </w:tcPr>
+          <w:p>
+            <w:r>
+              <w:rPr>
+                <w:sz w:val="19"/>
+                <w:szCs w:val="19"/>
+              </w:rPr>
+              <w:t xml:space="preserve">CONFIRMADO: porta de correr (em vermelho) na parede voltada para a nova área descoberta; parede voltada para a ETE sem aberturas. NÃO IDENTIFICÁVEL: nova posição das janelas (na planta só aparece a porta de correr). A "melhora sanitária" é interpretação; o slide só diz que as janelas mudaram de posição.</w:t>
+            </w:r>
+          </w:p>
+        </w:tc>
+      </w:tr>
+    </w:tbl>
+    <w:p>
+      <w:pPr>
+        <w:pStyle w:val="Heading2"/>
+      </w:pPr>
+      <w:r>
+        <w:t xml:space="preserve">6.2 Impacto por disciplina (seção 3)</w:t>
+      </w:r>
+    </w:p>
+    <w:tbl>
+      <w:tblPr>
+        <w:tblW w:type="dxa" w:w="9026"/>
+        <w:tblBorders>
+          <w:top w:val="single" w:color="auto" w:sz="4"/>
+          <w:left w:val="single" w:color="auto" w:sz="4"/>
+          <w:bottom w:val="single" w:color="auto" w:sz="4"/>
+          <w:right w:val="single" w:color="auto" w:sz="4"/>
+          <w:insideH w:val="single" w:color="auto" w:sz="4"/>
+          <w:insideV w:val="single" w:color="auto" w:sz="4"/>
+        </w:tblBorders>
+      </w:tblPr>
+      <w:tblGrid>
+        <w:gridCol w:w="2100"/>
+        <w:gridCol w:w="1500"/>
+        <w:gridCol w:w="5426"/>
+      </w:tblGrid>
+      <w:tr>
+        <w:trPr>
+          <w:tblHeader/>
+        </w:trPr>
+        <w:tc>
+          <w:tcPr>
+            <w:tcW w:type="dxa" w:w="2100"/>
+            <w:tcBorders>
+              <w:top w:val="single" w:color="BFBFBF" w:sz="4"/>
+              <w:left w:val="single" w:color="BFBFBF" w:sz="4"/>
+              <w:bottom w:val="single" w:color="BFBFBF" w:sz="4"/>
+              <w:right w:val="single" w:color="BFBFBF" w:sz="4"/>
+            </w:tcBorders>
+            <w:shd w:fill="00843D" w:color="auto" w:val="clear"/>
+            <w:tcMar>
+              <w:top w:type="dxa" w:w="60"/>
+              <w:left w:type="dxa" w:w="100"/>
+              <w:bottom w:type="dxa" w:w="60"/>
+              <w:right w:type="dxa" w:w="100"/>
+            </w:tcMar>
+          </w:tcPr>
+          <w:p>
+            <w:r>
+              <w:rPr>
+                <w:b/>
+                <w:bCs/>
+                <w:color w:val="FFFFFF"/>
+                <w:sz w:val="19"/>
+                <w:szCs w:val="19"/>
+              </w:rPr>
+              <w:t xml:space="preserve">Disciplina</w:t>
+            </w:r>
+          </w:p>
+        </w:tc>
+        <w:tc>
+          <w:tcPr>
+            <w:tcW w:type="dxa" w:w="1500"/>
+            <w:tcBorders>
+              <w:top w:val="single" w:color="BFBFBF" w:sz="4"/>
+              <w:left w:val="single" w:color="BFBFBF" w:sz="4"/>
+              <w:bottom w:val="single" w:color="BFBFBF" w:sz="4"/>
+              <w:right w:val="single" w:color="BFBFBF" w:sz="4"/>
+            </w:tcBorders>
+            <w:shd w:fill="00843D" w:color="auto" w:val="clear"/>
+            <w:tcMar>
+              <w:top w:type="dxa" w:w="60"/>
+              <w:left w:type="dxa" w:w="100"/>
+              <w:bottom w:type="dxa" w:w="60"/>
+              <w:right w:type="dxa" w:w="100"/>
+            </w:tcMar>
+          </w:tcPr>
+          <w:p>
+            <w:r>
+              <w:rPr>
+                <w:b/>
+                <w:bCs/>
+                <w:color w:val="FFFFFF"/>
+                <w:sz w:val="19"/>
+                <w:szCs w:val="19"/>
+              </w:rPr>
+              <w:t xml:space="preserve">Status</w:t>
+            </w:r>
+          </w:p>
+        </w:tc>
+        <w:tc>
+          <w:tcPr>
+            <w:tcW w:type="dxa" w:w="5426"/>
+            <w:tcBorders>
+              <w:top w:val="single" w:color="BFBFBF" w:sz="4"/>
+              <w:left w:val="single" w:color="BFBFBF" w:sz="4"/>
+              <w:bottom w:val="single" w:color="BFBFBF" w:sz="4"/>
+              <w:right w:val="single" w:color="BFBFBF" w:sz="4"/>
+            </w:tcBorders>
+            <w:shd w:fill="00843D" w:color="auto" w:val="clear"/>
+            <w:tcMar>
+              <w:top w:type="dxa" w:w="60"/>
+              <w:left w:type="dxa" w:w="100"/>
+              <w:bottom w:type="dxa" w:w="60"/>
+              <w:right w:type="dxa" w:w="100"/>
+            </w:tcMar>
+          </w:tcPr>
+          <w:p>
+            <w:r>
+              <w:rPr>
+                <w:b/>
+                <w:bCs/>
+                <w:color w:val="FFFFFF"/>
+                <w:sz w:val="19"/>
+                <w:szCs w:val="19"/>
+              </w:rPr>
+              <w:t xml:space="preserve">O que a planta mostra</w:t>
+            </w:r>
+          </w:p>
+        </w:tc>
+      </w:tr>
+      <w:tr>
+        <w:trPr>
+          <w:tblHeader w:val="false"/>
+        </w:trPr>
+        <w:tc>
+          <w:tcPr>
+            <w:tcW w:type="dxa" w:w="2100"/>
+            <w:tcBorders>
+              <w:top w:val="single" w:color="BFBFBF" w:sz="4"/>
+              <w:left w:val="single" w:color="BFBFBF" w:sz="4"/>
+              <w:bottom w:val="single" w:color="BFBFBF" w:sz="4"/>
+              <w:right w:val="single" w:color="BFBFBF" w:sz="4"/>
+            </w:tcBorders>
+            <w:tcMar>
+              <w:top w:type="dxa" w:w="60"/>
+              <w:left w:type="dxa" w:w="100"/>
+              <w:bottom w:type="dxa" w:w="60"/>
+              <w:right w:type="dxa" w:w="100"/>
+            </w:tcMar>
+          </w:tcPr>
+          <w:p>
+            <w:r>
+              <w:rPr>
+                <w:sz w:val="19"/>
+                <w:szCs w:val="19"/>
+              </w:rPr>
+              <w:t xml:space="preserve">Arquitetura e implantação</w:t>
+            </w:r>
+          </w:p>
+        </w:tc>
+        <w:tc>
+          <w:tcPr>
+            <w:tcW w:type="dxa" w:w="1500"/>
+            <w:tcBorders>
+              <w:top w:val="single" w:color="BFBFBF" w:sz="4"/>
+              <w:left w:val="single" w:color="BFBFBF" w:sz="4"/>
+              <w:bottom w:val="single" w:color="BFBFBF" w:sz="4"/>
+              <w:right w:val="single" w:color="BFBFBF" w:sz="4"/>
+            </w:tcBorders>
+            <w:shd w:fill="D9EAD3" w:color="auto" w:val="clear"/>
+            <w:tcMar>
+              <w:top w:type="dxa" w:w="60"/>
+              <w:left w:type="dxa" w:w="100"/>
+              <w:bottom w:type="dxa" w:w="60"/>
+              <w:right w:type="dxa" w:w="100"/>
+            </w:tcMar>
+          </w:tcPr>
+          <w:p>
+            <w:r>
+              <w:rPr>
+                <w:b/>
+                <w:bCs/>
+                <w:sz w:val="19"/>
+                <w:szCs w:val="19"/>
+              </w:rPr>
+              <w:t xml:space="preserve">Confirmado</w:t>
+            </w:r>
+          </w:p>
+        </w:tc>
+        <w:tc>
+          <w:tcPr>
+            <w:tcW w:type="dxa" w:w="5426"/>
+            <w:tcBorders>
+              <w:top w:val="single" w:color="BFBFBF" w:sz="4"/>
+              <w:left w:val="single" w:color="BFBFBF" w:sz="4"/>
+              <w:bottom w:val="single" w:color="BFBFBF" w:sz="4"/>
+              <w:right w:val="single" w:color="BFBFBF" w:sz="4"/>
+            </w:tcBorders>
+            <w:tcMar>
+              <w:top w:type="dxa" w:w="60"/>
+              <w:left w:type="dxa" w:w="100"/>
+              <w:bottom w:type="dxa" w:w="60"/>
+              <w:right w:type="dxa" w:w="100"/>
+            </w:tcMar>
+          </w:tcPr>
+          <w:p>
+            <w:r>
+              <w:rPr>
+                <w:sz w:val="19"/>
+                <w:szCs w:val="19"/>
+              </w:rPr>
+              <w:t xml:space="preserve">As alterações aparecem em implantação, fachada frontal (slide 7) e esquadrias (portas novas em vermelho).</w:t>
+            </w:r>
+          </w:p>
+        </w:tc>
+      </w:tr>
+      <w:tr>
+        <w:trPr>
+          <w:tblHeader w:val="false"/>
+        </w:trPr>
+        <w:tc>
+          <w:tcPr>
+            <w:tcW w:type="dxa" w:w="2100"/>
+            <w:tcBorders>
+              <w:top w:val="single" w:color="BFBFBF" w:sz="4"/>
+              <w:left w:val="single" w:color="BFBFBF" w:sz="4"/>
+              <w:bottom w:val="single" w:color="BFBFBF" w:sz="4"/>
+              <w:right w:val="single" w:color="BFBFBF" w:sz="4"/>
+            </w:tcBorders>
+            <w:tcMar>
+              <w:top w:type="dxa" w:w="60"/>
+              <w:left w:type="dxa" w:w="100"/>
+              <w:bottom w:type="dxa" w:w="60"/>
+              <w:right w:type="dxa" w:w="100"/>
+            </w:tcMar>
+          </w:tcPr>
+          <w:p>
+            <w:r>
+              <w:rPr>
+                <w:sz w:val="19"/>
+                <w:szCs w:val="19"/>
+              </w:rPr>
+              <w:t xml:space="preserve">Estrutura e geotecnia</w:t>
+            </w:r>
+          </w:p>
+        </w:tc>
+        <w:tc>
+          <w:tcPr>
+            <w:tcW w:type="dxa" w:w="1500"/>
+            <w:tcBorders>
+              <w:top w:val="single" w:color="BFBFBF" w:sz="4"/>
+              <w:left w:val="single" w:color="BFBFBF" w:sz="4"/>
+              <w:bottom w:val="single" w:color="BFBFBF" w:sz="4"/>
+              <w:right w:val="single" w:color="BFBFBF" w:sz="4"/>
+            </w:tcBorders>
+            <w:shd w:fill="D9EAD3" w:color="auto" w:val="clear"/>
+            <w:tcMar>
+              <w:top w:type="dxa" w:w="60"/>
+              <w:left w:type="dxa" w:w="100"/>
+              <w:bottom w:type="dxa" w:w="60"/>
+              <w:right w:type="dxa" w:w="100"/>
+            </w:tcMar>
+          </w:tcPr>
+          <w:p>
+            <w:r>
+              <w:rPr>
+                <w:b/>
+                <w:bCs/>
+                <w:sz w:val="19"/>
+                <w:szCs w:val="19"/>
+              </w:rPr>
+              <w:t xml:space="preserve">Confirmado</w:t>
+            </w:r>
+          </w:p>
+        </w:tc>
+        <w:tc>
+          <w:tcPr>
+            <w:tcW w:type="dxa" w:w="5426"/>
+            <w:tcBorders>
+              <w:top w:val="single" w:color="BFBFBF" w:sz="4"/>
+              <w:left w:val="single" w:color="BFBFBF" w:sz="4"/>
+              <w:bottom w:val="single" w:color="BFBFBF" w:sz="4"/>
+              <w:right w:val="single" w:color="BFBFBF" w:sz="4"/>
+            </w:tcBorders>
+            <w:tcMar>
+              <w:top w:type="dxa" w:w="60"/>
+              <w:left w:type="dxa" w:w="100"/>
+              <w:bottom w:type="dxa" w:w="60"/>
+              <w:right w:type="dxa" w:w="100"/>
+            </w:tcMar>
+          </w:tcPr>
+          <w:p>
+            <w:r>
+              <w:rPr>
+                <w:sz w:val="19"/>
+                <w:szCs w:val="19"/>
+              </w:rPr>
+              <w:t xml:space="preserve">Muro de contenção citado no slide 3; a faixa fica além do limite sem área alagada. Sondagem e projeto são recomendação, não constam.</w:t>
+            </w:r>
+          </w:p>
+        </w:tc>
+      </w:tr>
+      <w:tr>
+        <w:trPr>
+          <w:tblHeader w:val="false"/>
+        </w:trPr>
+        <w:tc>
+          <w:tcPr>
+            <w:tcW w:type="dxa" w:w="2100"/>
+            <w:tcBorders>
+              <w:top w:val="single" w:color="BFBFBF" w:sz="4"/>
+              <w:left w:val="single" w:color="BFBFBF" w:sz="4"/>
+              <w:bottom w:val="single" w:color="BFBFBF" w:sz="4"/>
+              <w:right w:val="single" w:color="BFBFBF" w:sz="4"/>
+            </w:tcBorders>
+            <w:tcMar>
+              <w:top w:type="dxa" w:w="60"/>
+              <w:left w:type="dxa" w:w="100"/>
+              <w:bottom w:type="dxa" w:w="60"/>
+              <w:right w:type="dxa" w:w="100"/>
+            </w:tcMar>
+          </w:tcPr>
+          <w:p>
+            <w:r>
+              <w:rPr>
+                <w:sz w:val="19"/>
+                <w:szCs w:val="19"/>
+              </w:rPr>
+              <w:t xml:space="preserve">Drenagem e hidráulica</w:t>
+            </w:r>
+          </w:p>
+        </w:tc>
+        <w:tc>
+          <w:tcPr>
+            <w:tcW w:type="dxa" w:w="1500"/>
+            <w:tcBorders>
+              <w:top w:val="single" w:color="BFBFBF" w:sz="4"/>
+              <w:left w:val="single" w:color="BFBFBF" w:sz="4"/>
+              <w:bottom w:val="single" w:color="BFBFBF" w:sz="4"/>
+              <w:right w:val="single" w:color="BFBFBF" w:sz="4"/>
+            </w:tcBorders>
+            <w:shd w:fill="FFF2CC" w:color="auto" w:val="clear"/>
+            <w:tcMar>
+              <w:top w:type="dxa" w:w="60"/>
+              <w:left w:type="dxa" w:w="100"/>
+              <w:bottom w:type="dxa" w:w="60"/>
+              <w:right w:type="dxa" w:w="100"/>
+            </w:tcMar>
+          </w:tcPr>
+          <w:p>
+            <w:r>
+              <w:rPr>
+                <w:b/>
+                <w:bCs/>
+                <w:sz w:val="19"/>
+                <w:szCs w:val="19"/>
+              </w:rPr>
+              <w:t xml:space="preserve">Parcial</w:t>
+            </w:r>
+          </w:p>
+        </w:tc>
+        <w:tc>
+          <w:tcPr>
+            <w:tcW w:type="dxa" w:w="5426"/>
+            <w:tcBorders>
+              <w:top w:val="single" w:color="BFBFBF" w:sz="4"/>
+              <w:left w:val="single" w:color="BFBFBF" w:sz="4"/>
+              <w:bottom w:val="single" w:color="BFBFBF" w:sz="4"/>
+              <w:right w:val="single" w:color="BFBFBF" w:sz="4"/>
+            </w:tcBorders>
+            <w:tcMar>
+              <w:top w:type="dxa" w:w="60"/>
+              <w:left w:type="dxa" w:w="100"/>
+              <w:bottom w:type="dxa" w:w="60"/>
+              <w:right w:type="dxa" w:w="100"/>
+            </w:tcMar>
+          </w:tcPr>
+          <w:p>
+            <w:r>
+              <w:rPr>
+                <w:sz w:val="19"/>
+                <w:szCs w:val="19"/>
+              </w:rPr>
+              <w:t xml:space="preserve">Drenagem citada só nas duas áreas descobertas (refeitório e lavagem). Nos fundos, só muro e pavimentação; na frente, nada.</w:t>
+            </w:r>
+          </w:p>
+        </w:tc>
+      </w:tr>
+      <w:tr>
+        <w:trPr>
+          <w:tblHeader w:val="false"/>
+        </w:trPr>
+        <w:tc>
+          <w:tcPr>
+            <w:tcW w:type="dxa" w:w="2100"/>
+            <w:tcBorders>
+              <w:top w:val="single" w:color="BFBFBF" w:sz="4"/>
+              <w:left w:val="single" w:color="BFBFBF" w:sz="4"/>
+              <w:bottom w:val="single" w:color="BFBFBF" w:sz="4"/>
+              <w:right w:val="single" w:color="BFBFBF" w:sz="4"/>
+            </w:tcBorders>
+            <w:tcMar>
+              <w:top w:type="dxa" w:w="60"/>
+              <w:left w:type="dxa" w:w="100"/>
+              <w:bottom w:type="dxa" w:w="60"/>
+              <w:right w:type="dxa" w:w="100"/>
+            </w:tcMar>
+          </w:tcPr>
+          <w:p>
+            <w:r>
+              <w:rPr>
+                <w:sz w:val="19"/>
+                <w:szCs w:val="19"/>
+              </w:rPr>
+              <w:t xml:space="preserve">Elétrica</w:t>
+            </w:r>
+          </w:p>
+        </w:tc>
+        <w:tc>
+          <w:tcPr>
+            <w:tcW w:type="dxa" w:w="1500"/>
+            <w:tcBorders>
+              <w:top w:val="single" w:color="BFBFBF" w:sz="4"/>
+              <w:left w:val="single" w:color="BFBFBF" w:sz="4"/>
+              <w:bottom w:val="single" w:color="BFBFBF" w:sz="4"/>
+              <w:right w:val="single" w:color="BFBFBF" w:sz="4"/>
+            </w:tcBorders>
+            <w:shd w:fill="D9EAD3" w:color="auto" w:val="clear"/>
+            <w:tcMar>
+              <w:top w:type="dxa" w:w="60"/>
+              <w:left w:type="dxa" w:w="100"/>
+              <w:bottom w:type="dxa" w:w="60"/>
+              <w:right w:type="dxa" w:w="100"/>
+            </w:tcMar>
+          </w:tcPr>
+          <w:p>
+            <w:r>
+              <w:rPr>
+                <w:b/>
+                <w:bCs/>
+                <w:sz w:val="19"/>
+                <w:szCs w:val="19"/>
+              </w:rPr>
+              <w:t xml:space="preserve">Confirmado</w:t>
+            </w:r>
+          </w:p>
+        </w:tc>
+        <w:tc>
+          <w:tcPr>
+            <w:tcW w:type="dxa" w:w="5426"/>
+            <w:tcBorders>
+              <w:top w:val="single" w:color="BFBFBF" w:sz="4"/>
+              <w:left w:val="single" w:color="BFBFBF" w:sz="4"/>
+              <w:bottom w:val="single" w:color="BFBFBF" w:sz="4"/>
+              <w:right w:val="single" w:color="BFBFBF" w:sz="4"/>
+            </w:tcBorders>
+            <w:tcMar>
+              <w:top w:type="dxa" w:w="60"/>
+              <w:left w:type="dxa" w:w="100"/>
+              <w:bottom w:type="dxa" w:w="60"/>
+              <w:right w:type="dxa" w:w="100"/>
+            </w:tcMar>
+          </w:tcPr>
+          <w:p>
+            <w:r>
+              <w:rPr>
+                <w:sz w:val="19"/>
+                <w:szCs w:val="19"/>
+              </w:rPr>
+              <w:t xml:space="preserve">A subestação ganhou porta dupla nova abrindo para a faixa frontal, atrás do muro. O gerador tem a face frontal ventilada voltada para o muro, a cerca de 3 m. Iluminação externa não consta (recomendação).</w:t>
+            </w:r>
+          </w:p>
+        </w:tc>
+      </w:tr>
+      <w:tr>
+        <w:trPr>
+          <w:tblHeader w:val="false"/>
+        </w:trPr>
+        <w:tc>
+          <w:tcPr>
+            <w:tcW w:type="dxa" w:w="2100"/>
+            <w:tcBorders>
+              <w:top w:val="single" w:color="BFBFBF" w:sz="4"/>
+              <w:left w:val="single" w:color="BFBFBF" w:sz="4"/>
+              <w:bottom w:val="single" w:color="BFBFBF" w:sz="4"/>
+              <w:right w:val="single" w:color="BFBFBF" w:sz="4"/>
+            </w:tcBorders>
+            <w:tcMar>
+              <w:top w:type="dxa" w:w="60"/>
+              <w:left w:type="dxa" w:w="100"/>
+              <w:bottom w:type="dxa" w:w="60"/>
+              <w:right w:type="dxa" w:w="100"/>
+            </w:tcMar>
+          </w:tcPr>
+          <w:p>
+            <w:r>
+              <w:rPr>
+                <w:sz w:val="19"/>
+                <w:szCs w:val="19"/>
+              </w:rPr>
+              <w:t xml:space="preserve">Acústica</w:t>
+            </w:r>
+          </w:p>
+        </w:tc>
+        <w:tc>
+          <w:tcPr>
+            <w:tcW w:type="dxa" w:w="1500"/>
+            <w:tcBorders>
+              <w:top w:val="single" w:color="BFBFBF" w:sz="4"/>
+              <w:left w:val="single" w:color="BFBFBF" w:sz="4"/>
+              <w:bottom w:val="single" w:color="BFBFBF" w:sz="4"/>
+              <w:right w:val="single" w:color="BFBFBF" w:sz="4"/>
+            </w:tcBorders>
+            <w:shd w:fill="D9EAD3" w:color="auto" w:val="clear"/>
+            <w:tcMar>
+              <w:top w:type="dxa" w:w="60"/>
+              <w:left w:type="dxa" w:w="100"/>
+              <w:bottom w:type="dxa" w:w="60"/>
+              <w:right w:type="dxa" w:w="100"/>
+            </w:tcMar>
+          </w:tcPr>
+          <w:p>
+            <w:r>
+              <w:rPr>
+                <w:b/>
+                <w:bCs/>
+                <w:sz w:val="19"/>
+                <w:szCs w:val="19"/>
+              </w:rPr>
+              <w:t xml:space="preserve">Confirmado</w:t>
+            </w:r>
+          </w:p>
+        </w:tc>
+        <w:tc>
+          <w:tcPr>
+            <w:tcW w:type="dxa" w:w="5426"/>
+            <w:tcBorders>
+              <w:top w:val="single" w:color="BFBFBF" w:sz="4"/>
+              <w:left w:val="single" w:color="BFBFBF" w:sz="4"/>
+              <w:bottom w:val="single" w:color="BFBFBF" w:sz="4"/>
+              <w:right w:val="single" w:color="BFBFBF" w:sz="4"/>
+            </w:tcBorders>
+            <w:tcMar>
+              <w:top w:type="dxa" w:w="60"/>
+              <w:left w:type="dxa" w:w="100"/>
+              <w:bottom w:type="dxa" w:w="60"/>
+              <w:right w:type="dxa" w:w="100"/>
+            </w:tcMar>
+          </w:tcPr>
+          <w:p>
+            <w:r>
+              <w:rPr>
+                <w:sz w:val="19"/>
+                <w:szCs w:val="19"/>
+              </w:rPr>
+              <w:t xml:space="preserve">Muro em frente a gerador e subestação; academia urbana é vizinha imediata e a UBS Gargaú fica logo atrás. A NBR 10151 é recomendação.</w:t>
+            </w:r>
+          </w:p>
+        </w:tc>
+      </w:tr>
+      <w:tr>
+        <w:trPr>
+          <w:tblHeader w:val="false"/>
+        </w:trPr>
+        <w:tc>
+          <w:tcPr>
+            <w:tcW w:type="dxa" w:w="2100"/>
+            <w:tcBorders>
+              <w:top w:val="single" w:color="BFBFBF" w:sz="4"/>
+              <w:left w:val="single" w:color="BFBFBF" w:sz="4"/>
+              <w:bottom w:val="single" w:color="BFBFBF" w:sz="4"/>
+              <w:right w:val="single" w:color="BFBFBF" w:sz="4"/>
+            </w:tcBorders>
+            <w:tcMar>
+              <w:top w:type="dxa" w:w="60"/>
+              <w:left w:type="dxa" w:w="100"/>
+              <w:bottom w:type="dxa" w:w="60"/>
+              <w:right w:type="dxa" w:w="100"/>
+            </w:tcMar>
+          </w:tcPr>
+          <w:p>
+            <w:r>
+              <w:rPr>
+                <w:sz w:val="19"/>
+                <w:szCs w:val="19"/>
+              </w:rPr>
+              <w:t xml:space="preserve">Incêndio e rotas de fuga</w:t>
+            </w:r>
+          </w:p>
+        </w:tc>
+        <w:tc>
+          <w:tcPr>
+            <w:tcW w:type="dxa" w:w="1500"/>
+            <w:tcBorders>
+              <w:top w:val="single" w:color="BFBFBF" w:sz="4"/>
+              <w:left w:val="single" w:color="BFBFBF" w:sz="4"/>
+              <w:bottom w:val="single" w:color="BFBFBF" w:sz="4"/>
+              <w:right w:val="single" w:color="BFBFBF" w:sz="4"/>
+            </w:tcBorders>
+            <w:shd w:fill="D9EAD3" w:color="auto" w:val="clear"/>
+            <w:tcMar>
+              <w:top w:type="dxa" w:w="60"/>
+              <w:left w:type="dxa" w:w="100"/>
+              <w:bottom w:type="dxa" w:w="60"/>
+              <w:right w:type="dxa" w:w="100"/>
+            </w:tcMar>
+          </w:tcPr>
+          <w:p>
+            <w:r>
+              <w:rPr>
+                <w:b/>
+                <w:bCs/>
+                <w:sz w:val="19"/>
+                <w:szCs w:val="19"/>
+              </w:rPr>
+              <w:t xml:space="preserve">Confirmado</w:t>
+            </w:r>
+          </w:p>
+        </w:tc>
+        <w:tc>
+          <w:tcPr>
+            <w:tcW w:type="dxa" w:w="5426"/>
+            <w:tcBorders>
+              <w:top w:val="single" w:color="BFBFBF" w:sz="4"/>
+              <w:left w:val="single" w:color="BFBFBF" w:sz="4"/>
+              <w:bottom w:val="single" w:color="BFBFBF" w:sz="4"/>
+              <w:right w:val="single" w:color="BFBFBF" w:sz="4"/>
+            </w:tcBorders>
+            <w:tcMar>
+              <w:top w:type="dxa" w:w="60"/>
+              <w:left w:type="dxa" w:w="100"/>
+              <w:bottom w:type="dxa" w:w="60"/>
+              <w:right w:type="dxa" w:w="100"/>
+            </w:tcMar>
+          </w:tcPr>
+          <w:p>
+            <w:r>
+              <w:rPr>
+                <w:sz w:val="19"/>
+                <w:szCs w:val="19"/>
+              </w:rPr>
+              <w:t xml:space="preserve">A escada externa e duas portas de saída dos fundos ficam dentro da faixa nova.</w:t>
+            </w:r>
+          </w:p>
+        </w:tc>
+      </w:tr>
+      <w:tr>
+        <w:trPr>
+          <w:tblHeader w:val="false"/>
+        </w:trPr>
+        <w:tc>
+          <w:tcPr>
+            <w:tcW w:type="dxa" w:w="2100"/>
+            <w:tcBorders>
+              <w:top w:val="single" w:color="BFBFBF" w:sz="4"/>
+              <w:left w:val="single" w:color="BFBFBF" w:sz="4"/>
+              <w:bottom w:val="single" w:color="BFBFBF" w:sz="4"/>
+              <w:right w:val="single" w:color="BFBFBF" w:sz="4"/>
+            </w:tcBorders>
+            <w:tcMar>
+              <w:top w:type="dxa" w:w="60"/>
+              <w:left w:type="dxa" w:w="100"/>
+              <w:bottom w:type="dxa" w:w="60"/>
+              <w:right w:type="dxa" w:w="100"/>
+            </w:tcMar>
+          </w:tcPr>
+          <w:p>
+            <w:r>
+              <w:rPr>
+                <w:sz w:val="19"/>
+                <w:szCs w:val="19"/>
+              </w:rPr>
+              <w:t xml:space="preserve">Sanitário</w:t>
+            </w:r>
+          </w:p>
+        </w:tc>
+        <w:tc>
+          <w:tcPr>
+            <w:tcW w:type="dxa" w:w="1500"/>
+            <w:tcBorders>
+              <w:top w:val="single" w:color="BFBFBF" w:sz="4"/>
+              <w:left w:val="single" w:color="BFBFBF" w:sz="4"/>
+              <w:bottom w:val="single" w:color="BFBFBF" w:sz="4"/>
+              <w:right w:val="single" w:color="BFBFBF" w:sz="4"/>
+            </w:tcBorders>
+            <w:shd w:fill="FFF2CC" w:color="auto" w:val="clear"/>
+            <w:tcMar>
+              <w:top w:type="dxa" w:w="60"/>
+              <w:left w:type="dxa" w:w="100"/>
+              <w:bottom w:type="dxa" w:w="60"/>
+              <w:right w:type="dxa" w:w="100"/>
+            </w:tcMar>
+          </w:tcPr>
+          <w:p>
+            <w:r>
+              <w:rPr>
+                <w:b/>
+                <w:bCs/>
+                <w:sz w:val="19"/>
+                <w:szCs w:val="19"/>
+              </w:rPr>
+              <w:t xml:space="preserve">Parcial</w:t>
+            </w:r>
+          </w:p>
+        </w:tc>
+        <w:tc>
+          <w:tcPr>
+            <w:tcW w:type="dxa" w:w="5426"/>
+            <w:tcBorders>
+              <w:top w:val="single" w:color="BFBFBF" w:sz="4"/>
+              <w:left w:val="single" w:color="BFBFBF" w:sz="4"/>
+              <w:bottom w:val="single" w:color="BFBFBF" w:sz="4"/>
+              <w:right w:val="single" w:color="BFBFBF" w:sz="4"/>
+            </w:tcBorders>
+            <w:tcMar>
+              <w:top w:type="dxa" w:w="60"/>
+              <w:left w:type="dxa" w:w="100"/>
+              <w:bottom w:type="dxa" w:w="60"/>
+              <w:right w:type="dxa" w:w="100"/>
+            </w:tcMar>
+          </w:tcPr>
+          <w:p>
+            <w:r>
+              <w:rPr>
+                <w:sz w:val="19"/>
+                <w:szCs w:val="19"/>
+              </w:rPr>
+              <w:t xml:space="preserve">Loja aberta ao público confirmada, com grade separando a loja do acesso de veículos e da guarita. A separação interna entre loja e produção não dá para verificar nesta escala.</w:t>
+            </w:r>
+          </w:p>
+        </w:tc>
+      </w:tr>
+      <w:tr>
+        <w:trPr>
+          <w:tblHeader w:val="false"/>
+        </w:trPr>
+        <w:tc>
+          <w:tcPr>
+            <w:tcW w:type="dxa" w:w="2100"/>
+            <w:tcBorders>
+              <w:top w:val="single" w:color="BFBFBF" w:sz="4"/>
+              <w:left w:val="single" w:color="BFBFBF" w:sz="4"/>
+              <w:bottom w:val="single" w:color="BFBFBF" w:sz="4"/>
+              <w:right w:val="single" w:color="BFBFBF" w:sz="4"/>
+            </w:tcBorders>
+            <w:tcMar>
+              <w:top w:type="dxa" w:w="60"/>
+              <w:left w:type="dxa" w:w="100"/>
+              <w:bottom w:type="dxa" w:w="60"/>
+              <w:right w:type="dxa" w:w="100"/>
+            </w:tcMar>
+          </w:tcPr>
+          <w:p>
+            <w:r>
+              <w:rPr>
+                <w:sz w:val="19"/>
+                <w:szCs w:val="19"/>
+              </w:rPr>
+              <w:t xml:space="preserve">Custo e prazo</w:t>
+            </w:r>
+          </w:p>
+        </w:tc>
+        <w:tc>
+          <w:tcPr>
+            <w:tcW w:type="dxa" w:w="1500"/>
+            <w:tcBorders>
+              <w:top w:val="single" w:color="BFBFBF" w:sz="4"/>
+              <w:left w:val="single" w:color="BFBFBF" w:sz="4"/>
+              <w:bottom w:val="single" w:color="BFBFBF" w:sz="4"/>
+              <w:right w:val="single" w:color="BFBFBF" w:sz="4"/>
+            </w:tcBorders>
+            <w:shd w:fill="FFF2CC" w:color="auto" w:val="clear"/>
+            <w:tcMar>
+              <w:top w:type="dxa" w:w="60"/>
+              <w:left w:type="dxa" w:w="100"/>
+              <w:bottom w:type="dxa" w:w="60"/>
+              <w:right w:type="dxa" w:w="100"/>
+            </w:tcMar>
+          </w:tcPr>
+          <w:p>
+            <w:r>
+              <w:rPr>
+                <w:b/>
+                <w:bCs/>
+                <w:sz w:val="19"/>
+                <w:szCs w:val="19"/>
+              </w:rPr>
+              <w:t xml:space="preserve">Parcial</w:t>
+            </w:r>
+          </w:p>
+        </w:tc>
+        <w:tc>
+          <w:tcPr>
+            <w:tcW w:type="dxa" w:w="5426"/>
+            <w:tcBorders>
+              <w:top w:val="single" w:color="BFBFBF" w:sz="4"/>
+              <w:left w:val="single" w:color="BFBFBF" w:sz="4"/>
+              <w:bottom w:val="single" w:color="BFBFBF" w:sz="4"/>
+              <w:right w:val="single" w:color="BFBFBF" w:sz="4"/>
+            </w:tcBorders>
+            <w:tcMar>
+              <w:top w:type="dxa" w:w="60"/>
+              <w:left w:type="dxa" w:w="100"/>
+              <w:bottom w:type="dxa" w:w="60"/>
+              <w:right w:type="dxa" w:w="100"/>
+            </w:tcMar>
+          </w:tcPr>
+          <w:p>
+            <w:r>
+              <w:rPr>
+                <w:sz w:val="19"/>
+                <w:szCs w:val="19"/>
+              </w:rPr>
+              <w:t xml:space="preserve">Muro de contenção, pavimentação, drenagem (áreas descobertas), grades, portões e muro acústico constam. Aterro e reaprovação na Prefeitura são dedução.</w:t>
+            </w:r>
+          </w:p>
+        </w:tc>
+      </w:tr>
+    </w:tbl>
+    <w:p>
+      <w:pPr>
+        <w:pStyle w:val="Heading2"/>
+      </w:pPr>
+      <w:r>
+        <w:t xml:space="preserve">6.3 Pontos a confirmar (seção 4)</w:t>
+      </w:r>
+    </w:p>
+    <w:tbl>
+      <w:tblPr>
+        <w:tblW w:type="dxa" w:w="9026"/>
+        <w:tblBorders>
+          <w:top w:val="single" w:color="auto" w:sz="4"/>
+          <w:left w:val="single" w:color="auto" w:sz="4"/>
+          <w:bottom w:val="single" w:color="auto" w:sz="4"/>
+          <w:right w:val="single" w:color="auto" w:sz="4"/>
+          <w:insideH w:val="single" w:color="auto" w:sz="4"/>
+          <w:insideV w:val="single" w:color="auto" w:sz="4"/>
+        </w:tblBorders>
+      </w:tblPr>
+      <w:tblGrid>
+        <w:gridCol w:w="2100"/>
+        <w:gridCol w:w="1500"/>
+        <w:gridCol w:w="5426"/>
+      </w:tblGrid>
+      <w:tr>
+        <w:trPr>
+          <w:tblHeader/>
+        </w:trPr>
+        <w:tc>
+          <w:tcPr>
+            <w:tcW w:type="dxa" w:w="2100"/>
+            <w:tcBorders>
+              <w:top w:val="single" w:color="BFBFBF" w:sz="4"/>
+              <w:left w:val="single" w:color="BFBFBF" w:sz="4"/>
+              <w:bottom w:val="single" w:color="BFBFBF" w:sz="4"/>
+              <w:right w:val="single" w:color="BFBFBF" w:sz="4"/>
+            </w:tcBorders>
+            <w:shd w:fill="00843D" w:color="auto" w:val="clear"/>
+            <w:tcMar>
+              <w:top w:type="dxa" w:w="60"/>
+              <w:left w:type="dxa" w:w="100"/>
+              <w:bottom w:type="dxa" w:w="60"/>
+              <w:right w:type="dxa" w:w="100"/>
+            </w:tcMar>
+          </w:tcPr>
+          <w:p>
+            <w:r>
+              <w:rPr>
+                <w:b/>
+                <w:bCs/>
+                <w:color w:val="FFFFFF"/>
+                <w:sz w:val="19"/>
+                <w:szCs w:val="19"/>
+              </w:rPr>
+              <w:t xml:space="preserve">Ponto</w:t>
+            </w:r>
+          </w:p>
+        </w:tc>
+        <w:tc>
+          <w:tcPr>
+            <w:tcW w:type="dxa" w:w="1500"/>
+            <w:tcBorders>
+              <w:top w:val="single" w:color="BFBFBF" w:sz="4"/>
+              <w:left w:val="single" w:color="BFBFBF" w:sz="4"/>
+              <w:bottom w:val="single" w:color="BFBFBF" w:sz="4"/>
+              <w:right w:val="single" w:color="BFBFBF" w:sz="4"/>
+            </w:tcBorders>
+            <w:shd w:fill="00843D" w:color="auto" w:val="clear"/>
+            <w:tcMar>
+              <w:top w:type="dxa" w:w="60"/>
+              <w:left w:type="dxa" w:w="100"/>
+              <w:bottom w:type="dxa" w:w="60"/>
+              <w:right w:type="dxa" w:w="100"/>
+            </w:tcMar>
+          </w:tcPr>
+          <w:p>
+            <w:r>
+              <w:rPr>
+                <w:b/>
+                <w:bCs/>
+                <w:color w:val="FFFFFF"/>
+                <w:sz w:val="19"/>
+                <w:szCs w:val="19"/>
+              </w:rPr>
+              <w:t xml:space="preserve">Status</w:t>
+            </w:r>
+          </w:p>
+        </w:tc>
+        <w:tc>
+          <w:tcPr>
+            <w:tcW w:type="dxa" w:w="5426"/>
+            <w:tcBorders>
+              <w:top w:val="single" w:color="BFBFBF" w:sz="4"/>
+              <w:left w:val="single" w:color="BFBFBF" w:sz="4"/>
+              <w:bottom w:val="single" w:color="BFBFBF" w:sz="4"/>
+              <w:right w:val="single" w:color="BFBFBF" w:sz="4"/>
+            </w:tcBorders>
+            <w:shd w:fill="00843D" w:color="auto" w:val="clear"/>
+            <w:tcMar>
+              <w:top w:type="dxa" w:w="60"/>
+              <w:left w:type="dxa" w:w="100"/>
+              <w:bottom w:type="dxa" w:w="60"/>
+              <w:right w:type="dxa" w:w="100"/>
+            </w:tcMar>
+          </w:tcPr>
+          <w:p>
+            <w:r>
+              <w:rPr>
+                <w:b/>
+                <w:bCs/>
+                <w:color w:val="FFFFFF"/>
+                <w:sz w:val="19"/>
+                <w:szCs w:val="19"/>
+              </w:rPr>
+              <w:t xml:space="preserve">O que a planta mostra</w:t>
+            </w:r>
+          </w:p>
+        </w:tc>
+      </w:tr>
+      <w:tr>
+        <w:trPr>
+          <w:tblHeader w:val="false"/>
+        </w:trPr>
+        <w:tc>
+          <w:tcPr>
+            <w:tcW w:type="dxa" w:w="2100"/>
+            <w:tcBorders>
+              <w:top w:val="single" w:color="BFBFBF" w:sz="4"/>
+              <w:left w:val="single" w:color="BFBFBF" w:sz="4"/>
+              <w:bottom w:val="single" w:color="BFBFBF" w:sz="4"/>
+              <w:right w:val="single" w:color="BFBFBF" w:sz="4"/>
+            </w:tcBorders>
+            <w:tcMar>
+              <w:top w:type="dxa" w:w="60"/>
+              <w:left w:type="dxa" w:w="100"/>
+              <w:bottom w:type="dxa" w:w="60"/>
+              <w:right w:type="dxa" w:w="100"/>
+            </w:tcMar>
+          </w:tcPr>
+          <w:p>
+            <w:r>
+              <w:rPr>
+                <w:sz w:val="19"/>
+                <w:szCs w:val="19"/>
+              </w:rPr>
+              <w:t xml:space="preserve">1. Deslocamento da edificação</w:t>
+            </w:r>
+          </w:p>
+        </w:tc>
+        <w:tc>
+          <w:tcPr>
+            <w:tcW w:type="dxa" w:w="1500"/>
+            <w:tcBorders>
+              <w:top w:val="single" w:color="BFBFBF" w:sz="4"/>
+              <w:left w:val="single" w:color="BFBFBF" w:sz="4"/>
+              <w:bottom w:val="single" w:color="BFBFBF" w:sz="4"/>
+              <w:right w:val="single" w:color="BFBFBF" w:sz="4"/>
+            </w:tcBorders>
+            <w:shd w:fill="FFF2CC" w:color="auto" w:val="clear"/>
+            <w:tcMar>
+              <w:top w:type="dxa" w:w="60"/>
+              <w:left w:type="dxa" w:w="100"/>
+              <w:bottom w:type="dxa" w:w="60"/>
+              <w:right w:type="dxa" w:w="100"/>
+            </w:tcMar>
+          </w:tcPr>
+          <w:p>
+            <w:r>
+              <w:rPr>
+                <w:b/>
+                <w:bCs/>
+                <w:sz w:val="19"/>
+                <w:szCs w:val="19"/>
+              </w:rPr>
+              <w:t xml:space="preserve">Parcial</w:t>
+            </w:r>
+          </w:p>
+        </w:tc>
+        <w:tc>
+          <w:tcPr>
+            <w:tcW w:type="dxa" w:w="5426"/>
+            <w:tcBorders>
+              <w:top w:val="single" w:color="BFBFBF" w:sz="4"/>
+              <w:left w:val="single" w:color="BFBFBF" w:sz="4"/>
+              <w:bottom w:val="single" w:color="BFBFBF" w:sz="4"/>
+              <w:right w:val="single" w:color="BFBFBF" w:sz="4"/>
+            </w:tcBorders>
+            <w:tcMar>
+              <w:top w:type="dxa" w:w="60"/>
+              <w:left w:type="dxa" w:w="100"/>
+              <w:bottom w:type="dxa" w:w="60"/>
+              <w:right w:type="dxa" w:w="100"/>
+            </w:tcMar>
+          </w:tcPr>
+          <w:p>
+            <w:r>
+              <w:rPr>
+                <w:sz w:val="19"/>
+                <w:szCs w:val="19"/>
+              </w:rPr>
+              <w:t xml:space="preserve">A parede dos fundos fica sobre o limite sem área alagada e a frente a 3,00 m da divisa; só escada e patamar entram na faixa. O prédio não invade a área alagada. Se ele foi deslocado em relação à versão anterior só dá para saber com o layout anterior.</w:t>
+            </w:r>
+          </w:p>
+        </w:tc>
+      </w:tr>
+      <w:tr>
+        <w:trPr>
+          <w:tblHeader w:val="false"/>
+        </w:trPr>
+        <w:tc>
+          <w:tcPr>
+            <w:tcW w:type="dxa" w:w="2100"/>
+            <w:tcBorders>
+              <w:top w:val="single" w:color="BFBFBF" w:sz="4"/>
+              <w:left w:val="single" w:color="BFBFBF" w:sz="4"/>
+              <w:bottom w:val="single" w:color="BFBFBF" w:sz="4"/>
+              <w:right w:val="single" w:color="BFBFBF" w:sz="4"/>
+            </w:tcBorders>
+            <w:tcMar>
+              <w:top w:type="dxa" w:w="60"/>
+              <w:left w:type="dxa" w:w="100"/>
+              <w:bottom w:type="dxa" w:w="60"/>
+              <w:right w:type="dxa" w:w="100"/>
+            </w:tcMar>
+          </w:tcPr>
+          <w:p>
+            <w:r>
+              <w:rPr>
+                <w:sz w:val="19"/>
+                <w:szCs w:val="19"/>
+              </w:rPr>
+              <w:t xml:space="preserve">2. Permeabilidade</w:t>
+            </w:r>
+          </w:p>
+        </w:tc>
+        <w:tc>
+          <w:tcPr>
+            <w:tcW w:type="dxa" w:w="1500"/>
+            <w:tcBorders>
+              <w:top w:val="single" w:color="BFBFBF" w:sz="4"/>
+              <w:left w:val="single" w:color="BFBFBF" w:sz="4"/>
+              <w:bottom w:val="single" w:color="BFBFBF" w:sz="4"/>
+              <w:right w:val="single" w:color="BFBFBF" w:sz="4"/>
+            </w:tcBorders>
+            <w:shd w:fill="E7E6E6" w:color="auto" w:val="clear"/>
+            <w:tcMar>
+              <w:top w:type="dxa" w:w="60"/>
+              <w:left w:type="dxa" w:w="100"/>
+              <w:bottom w:type="dxa" w:w="60"/>
+              <w:right w:type="dxa" w:w="100"/>
+            </w:tcMar>
+          </w:tcPr>
+          <w:p>
+            <w:r>
+              <w:rPr>
+                <w:b/>
+                <w:bCs/>
+                <w:sz w:val="19"/>
+                <w:szCs w:val="19"/>
+              </w:rPr>
+              <w:t xml:space="preserve">Não verificável</w:t>
+            </w:r>
+          </w:p>
+        </w:tc>
+        <w:tc>
+          <w:tcPr>
+            <w:tcW w:type="dxa" w:w="5426"/>
+            <w:tcBorders>
+              <w:top w:val="single" w:color="BFBFBF" w:sz="4"/>
+              <w:left w:val="single" w:color="BFBFBF" w:sz="4"/>
+              <w:bottom w:val="single" w:color="BFBFBF" w:sz="4"/>
+              <w:right w:val="single" w:color="BFBFBF" w:sz="4"/>
+            </w:tcBorders>
+            <w:tcMar>
+              <w:top w:type="dxa" w:w="60"/>
+              <w:left w:type="dxa" w:w="100"/>
+              <w:bottom w:type="dxa" w:w="60"/>
+              <w:right w:type="dxa" w:w="100"/>
+            </w:tcMar>
+          </w:tcPr>
+          <w:p>
+            <w:r>
+              <w:rPr>
+                <w:sz w:val="19"/>
+                <w:szCs w:val="19"/>
+              </w:rPr>
+              <w:t xml:space="preserve">A apresentação não tem quadro de áreas nem cotas das áreas pavimentadas.</w:t>
+            </w:r>
+          </w:p>
+        </w:tc>
+      </w:tr>
+      <w:tr>
+        <w:trPr>
+          <w:tblHeader w:val="false"/>
+        </w:trPr>
+        <w:tc>
+          <w:tcPr>
+            <w:tcW w:type="dxa" w:w="2100"/>
+            <w:tcBorders>
+              <w:top w:val="single" w:color="BFBFBF" w:sz="4"/>
+              <w:left w:val="single" w:color="BFBFBF" w:sz="4"/>
+              <w:bottom w:val="single" w:color="BFBFBF" w:sz="4"/>
+              <w:right w:val="single" w:color="BFBFBF" w:sz="4"/>
+            </w:tcBorders>
+            <w:tcMar>
+              <w:top w:type="dxa" w:w="60"/>
+              <w:left w:type="dxa" w:w="100"/>
+              <w:bottom w:type="dxa" w:w="60"/>
+              <w:right w:type="dxa" w:w="100"/>
+            </w:tcMar>
+          </w:tcPr>
+          <w:p>
+            <w:r>
+              <w:rPr>
+                <w:sz w:val="19"/>
+                <w:szCs w:val="19"/>
+              </w:rPr>
+              <w:t xml:space="preserve">3. Subestação</w:t>
+            </w:r>
+          </w:p>
+        </w:tc>
+        <w:tc>
+          <w:tcPr>
+            <w:tcW w:type="dxa" w:w="1500"/>
+            <w:tcBorders>
+              <w:top w:val="single" w:color="BFBFBF" w:sz="4"/>
+              <w:left w:val="single" w:color="BFBFBF" w:sz="4"/>
+              <w:bottom w:val="single" w:color="BFBFBF" w:sz="4"/>
+              <w:right w:val="single" w:color="BFBFBF" w:sz="4"/>
+            </w:tcBorders>
+            <w:shd w:fill="D9EAD3" w:color="auto" w:val="clear"/>
+            <w:tcMar>
+              <w:top w:type="dxa" w:w="60"/>
+              <w:left w:type="dxa" w:w="100"/>
+              <w:bottom w:type="dxa" w:w="60"/>
+              <w:right w:type="dxa" w:w="100"/>
+            </w:tcMar>
+          </w:tcPr>
+          <w:p>
+            <w:r>
+              <w:rPr>
+                <w:b/>
+                <w:bCs/>
+                <w:sz w:val="19"/>
+                <w:szCs w:val="19"/>
+              </w:rPr>
+              <w:t xml:space="preserve">Confirmado</w:t>
+            </w:r>
+          </w:p>
+        </w:tc>
+        <w:tc>
+          <w:tcPr>
+            <w:tcW w:type="dxa" w:w="5426"/>
+            <w:tcBorders>
+              <w:top w:val="single" w:color="BFBFBF" w:sz="4"/>
+              <w:left w:val="single" w:color="BFBFBF" w:sz="4"/>
+              <w:bottom w:val="single" w:color="BFBFBF" w:sz="4"/>
+              <w:right w:val="single" w:color="BFBFBF" w:sz="4"/>
+            </w:tcBorders>
+            <w:tcMar>
+              <w:top w:type="dxa" w:w="60"/>
+              <w:left w:type="dxa" w:w="100"/>
+              <w:bottom w:type="dxa" w:w="60"/>
+              <w:right w:type="dxa" w:w="100"/>
+            </w:tcMar>
+          </w:tcPr>
+          <w:p>
+            <w:r>
+              <w:rPr>
+                <w:sz w:val="19"/>
+                <w:szCs w:val="19"/>
+              </w:rPr>
+              <w:t xml:space="preserve">A porta da subestação abre para a faixa frontal, atrás do muro; a concessionária só entra pelos portões. Confirmar com a concessionária.</w:t>
+            </w:r>
+          </w:p>
+        </w:tc>
+      </w:tr>
+    </w:tbl>
+    <w:p>
+      <w:pPr>
+        <w:pStyle w:val="Heading2"/>
+      </w:pPr>
+      <w:r>
+        <w:t xml:space="preserve">6.4 Correções sugeridas no texto</w:t>
+      </w:r>
+    </w:p>
+    <w:p>
+      <w:pPr>
+        <w:pStyle w:val="ListParagraph"/>
+        <w:numPr>
+          <w:ilvl w:val="0"/>
+          <w:numId w:val="2"/>
+        </w:numPr>
+        <w:spacing w:after="80"/>
+      </w:pPr>
+      <w:r>
+        <w:rPr>
+          <w:b/>
+          <w:bCs/>
+        </w:rPr>
+        <w:t xml:space="preserve">Seção 2, linha 1: </w:t>
+      </w:r>
+      <w:r>
+        <w:t xml:space="preserve">a escada e o patamar ficam na faixa (confirmado), mas a parede da edificação fica sobre o limite; o "pode avançar" vale só para escada, patamar e muro.</w:t>
+      </w:r>
+    </w:p>
+    <w:p>
+      <w:pPr>
+        <w:pStyle w:val="ListParagraph"/>
+        <w:numPr>
+          <w:ilvl w:val="0"/>
+          <w:numId w:val="2"/>
+        </w:numPr>
+        <w:spacing w:after="80"/>
+      </w:pPr>
+      <w:r>
+        <w:rPr>
+          <w:b/>
+          <w:bCs/>
+        </w:rPr>
+        <w:t xml:space="preserve">Seção 2, linha 2: </w:t>
+      </w:r>
+      <w:r>
+        <w:t xml:space="preserve">"faixa livre pavimentada e drenada" não consta na apresentação; tratar como item a confirmar.</w:t>
+      </w:r>
+    </w:p>
+    <w:p>
+      <w:pPr>
+        <w:pStyle w:val="ListParagraph"/>
+        <w:numPr>
+          <w:ilvl w:val="0"/>
+          <w:numId w:val="2"/>
+        </w:numPr>
+        <w:spacing w:after="80"/>
+      </w:pPr>
+      <w:r>
+        <w:rPr>
+          <w:b/>
+          <w:bCs/>
+        </w:rPr>
+        <w:t xml:space="preserve">Seção 2, linha 5: </w:t>
+      </w:r>
+      <w:r>
+        <w:t xml:space="preserve">a nova posição das janelas não aparece na planta; só a porta de correr.</w:t>
+      </w:r>
+    </w:p>
+    <w:p>
+      <w:pPr>
+        <w:pStyle w:val="ListParagraph"/>
+        <w:numPr>
+          <w:ilvl w:val="0"/>
+          <w:numId w:val="2"/>
+        </w:numPr>
+        <w:spacing w:after="80"/>
+      </w:pPr>
+      <w:r>
+        <w:rPr>
+          <w:b/>
+          <w:bCs/>
+        </w:rPr>
+        <w:t xml:space="preserve">Seção 3, drenagem: </w:t>
+      </w:r>
+      <w:r>
+        <w:t xml:space="preserve">a apresentação só prevê drenagem nas duas áreas descobertas; nas faixas frontal e dos fundos, é recomendação.</w:t>
+      </w:r>
+    </w:p>
+    <w:p>
+      <w:pPr>
+        <w:pStyle w:val="ListParagraph"/>
+        <w:numPr>
+          <w:ilvl w:val="0"/>
+          <w:numId w:val="2"/>
+        </w:numPr>
+        <w:spacing w:after="80"/>
+      </w:pPr>
+      <w:r>
+        <w:rPr>
+          <w:b/>
+          <w:bCs/>
+        </w:rPr>
+        <w:t xml:space="preserve">Seção 3, custo: </w:t>
+      </w:r>
+      <w:r>
+        <w:t xml:space="preserve">"aterro" não consta; é dedução a partir do muro de contenção.</w:t>
+      </w:r>
+    </w:p>
+    <w:p>
+      <w:pPr>
+        <w:pStyle w:val="Heading2"/>
+      </w:pPr>
+      <w:r>
+        <w:t xml:space="preserve">6.5 Trechos ampliados da planta</w:t>
+      </w:r>
+    </w:p>
+    <w:p>
+      <w:pPr>
+        <w:keepNext/>
+        <w:jc w:val="center"/>
+      </w:pPr>
+      <w:r>
+        <w:drawing>
+          <wp:inline distT="0" distB="0" distL="0" distR="0">
+            <wp:extent cx="5715000" cy="1685925"/>
+            <wp:effectExtent t="0" r="0" b="0" l="0"/>
+            <wp:docPr id="1" name="" descr="" title=""/>
+            <wp:cNvGraphicFramePr>
+              <a:graphicFrameLocks xmlns:a="http://schemas.openxmlformats.org/drawingml/2006/main" noChangeAspect="1"/>
+            </wp:cNvGraphicFramePr>
+            <a:graphic xmlns:a="http://schemas.openxmlformats.org/drawingml/2006/main">
+              <a:graphicData uri="http://schemas.openxmlformats.org/drawingml/2006/picture">
+                <pic:pic xmlns:pic="http://schemas.openxmlformats.org/drawingml/2006/picture">
+                  <pic:nvPicPr>
+                    <pic:cNvPr id="0" name="" descr=""/>
+                    <pic:cNvPicPr>
+                      <a:picLocks noChangeAspect="1" noChangeArrowheads="1"/>
+                    </pic:cNvPicPr>
+                  </pic:nvPicPr>
+                  <pic:blipFill>
+                    <a:blip r:embed="rId9" cstate="none"/>
+                    <a:srcRect/>
+                    <a:stretch>
+                      <a:fillRect/>
+                    </a:stretch>
+                  </pic:blipFill>
+                  <pic:spPr bwMode="auto">
+                    <a:xfrm>
+                      <a:off x="0" y="0"/>
+                      <a:ext cx="5715000" cy="1685925"/>
+                    </a:xfrm>
+                    <a:prstGeom prst="rect">
+                      <a:avLst/>
+                    </a:prstGeom>
+                  </pic:spPr>
+                </pic:pic>
+              </a:graphicData>
+            </a:graphic>
+          </wp:inline>
+        </w:drawing>
+      </w:r>
+    </w:p>
+    <w:p>
+      <w:pPr>
+        <w:spacing w:after="200"/>
+        <w:jc w:val="center"/>
+      </w:pPr>
+      <w:r>
+        <w:rPr>
+          <w:i/>
+          <w:iCs/>
+          <w:color w:val="595959"/>
+          <w:sz w:val="18"/>
+          <w:szCs w:val="18"/>
+        </w:rPr>
+        <w:t xml:space="preserve">Figura 2 – Fundos: parede no limite sem área alagada; escada, patamar e portas dentro da faixa vermelha (slide 3).</w:t>
+      </w:r>
+    </w:p>
+    <w:p>
+      <w:pPr>
+        <w:keepNext/>
+        <w:jc w:val="center"/>
+      </w:pPr>
+      <w:r>
+        <w:drawing>
+          <wp:inline distT="0" distB="0" distL="0" distR="0">
+            <wp:extent cx="4953000" cy="2657475"/>
+            <wp:effectExtent t="0" r="0" b="0" l="0"/>
+            <wp:docPr id="1" name="" descr="" title=""/>
+            <wp:cNvGraphicFramePr>
+              <a:graphicFrameLocks xmlns:a="http://schemas.openxmlformats.org/drawingml/2006/main" noChangeAspect="1"/>
+            </wp:cNvGraphicFramePr>
+            <a:graphic xmlns:a="http://schemas.openxmlformats.org/drawingml/2006/main">
+              <a:graphicData uri="http://schemas.openxmlformats.org/drawingml/2006/picture">
+                <pic:pic xmlns:pic="http://schemas.openxmlformats.org/drawingml/2006/picture">
+                  <pic:nvPicPr>
+                    <pic:cNvPr id="0" name="" descr=""/>
+                    <pic:cNvPicPr>
+                      <a:picLocks noChangeAspect="1" noChangeArrowheads="1"/>
+                    </pic:cNvPicPr>
+                  </pic:nvPicPr>
+                  <pic:blipFill>
+                    <a:blip r:embed="rId10" cstate="none"/>
+                    <a:srcRect/>
+                    <a:stretch>
+                      <a:fillRect/>
+                    </a:stretch>
+                  </pic:blipFill>
+                  <pic:spPr bwMode="auto">
+                    <a:xfrm>
+                      <a:off x="0" y="0"/>
+                      <a:ext cx="4953000" cy="2657475"/>
+                    </a:xfrm>
+                    <a:prstGeom prst="rect">
+                      <a:avLst/>
+                    </a:prstGeom>
+                  </pic:spPr>
+                </pic:pic>
+              </a:graphicData>
+            </a:graphic>
+          </wp:inline>
+        </w:drawing>
+      </w:r>
+    </w:p>
+    <w:p>
+      <w:pPr>
+        <w:spacing w:after="200"/>
+        <w:jc w:val="center"/>
+      </w:pPr>
+      <w:r>
+        <w:rPr>
+          <w:i/>
+          <w:iCs/>
+          <w:color w:val="595959"/>
+          <w:sz w:val="18"/>
+          <w:szCs w:val="18"/>
+        </w:rPr>
+        <w:t xml:space="preserve">Figura 3 – Frente: afastamento 3,00 m, porta nova da subestação voltada à faixa, muro na divisa e porta nova do refeitório (slide 6).</w:t>
+      </w:r>
+    </w:p>
+    <w:p>
+      <w:pPr>
+        <w:keepNext/>
+        <w:jc w:val="center"/>
+      </w:pPr>
+      <w:r>
+        <w:drawing>
+          <wp:inline distT="0" distB="0" distL="0" distR="0">
+            <wp:extent cx="5715000" cy="1304925"/>
+            <wp:effectExtent t="0" r="0" b="0" l="0"/>
+            <wp:docPr id="1" name="" descr="" title=""/>
+            <wp:cNvGraphicFramePr>
+              <a:graphicFrameLocks xmlns:a="http://schemas.openxmlformats.org/drawingml/2006/main" noChangeAspect="1"/>
+            </wp:cNvGraphicFramePr>
+            <a:graphic xmlns:a="http://schemas.openxmlformats.org/drawingml/2006/main">
+              <a:graphicData uri="http://schemas.openxmlformats.org/drawingml/2006/picture">
+                <pic:pic xmlns:pic="http://schemas.openxmlformats.org/drawingml/2006/picture">
+                  <pic:nvPicPr>
+                    <pic:cNvPr id="0" name="" descr=""/>
+                    <pic:cNvPicPr>
+                      <a:picLocks noChangeAspect="1" noChangeArrowheads="1"/>
+                    </pic:cNvPicPr>
+                  </pic:nvPicPr>
+                  <pic:blipFill>
+                    <a:blip r:embed="rId11" cstate="none"/>
+                    <a:srcRect/>
+                    <a:stretch>
+                      <a:fillRect/>
+                    </a:stretch>
+                  </pic:blipFill>
+                  <pic:spPr bwMode="auto">
+                    <a:xfrm>
+                      <a:off x="0" y="0"/>
+                      <a:ext cx="5715000" cy="1304925"/>
+                    </a:xfrm>
+                    <a:prstGeom prst="rect">
+                      <a:avLst/>
+                    </a:prstGeom>
+                  </pic:spPr>
+                </pic:pic>
+              </a:graphicData>
+            </a:graphic>
+          </wp:inline>
+        </w:drawing>
+      </w:r>
+    </w:p>
+    <w:p>
+      <w:pPr>
+        <w:spacing w:after="200"/>
+        <w:jc w:val="center"/>
+      </w:pPr>
+      <w:r>
+        <w:rPr>
+          <w:i/>
+          <w:iCs/>
+          <w:color w:val="595959"/>
+          <w:sz w:val="18"/>
+          <w:szCs w:val="18"/>
+        </w:rPr>
+        <w:t xml:space="preserve">Figura 4 – Frente, lado da loja: loja sem fechamento, grade a partir da lateral da loja e portão de pedestres (slide 6).</w:t>
+      </w:r>
+    </w:p>
+    <w:p>
+      <w:pPr>
+        <w:keepNext/>
+        <w:jc w:val="center"/>
+      </w:pPr>
+      <w:r>
+        <w:drawing>
+          <wp:inline distT="0" distB="0" distL="0" distR="0">
+            <wp:extent cx="4095750" cy="3162300"/>
+            <wp:effectExtent t="0" r="0" b="0" l="0"/>
+            <wp:docPr id="1" name="" descr="" title=""/>
+            <wp:cNvGraphicFramePr>
+              <a:graphicFrameLocks xmlns:a="http://schemas.openxmlformats.org/drawingml/2006/main" noChangeAspect="1"/>
+            </wp:cNvGraphicFramePr>
+            <a:graphic xmlns:a="http://schemas.openxmlformats.org/drawingml/2006/main">
+              <a:graphicData uri="http://schemas.openxmlformats.org/drawingml/2006/picture">
+                <pic:pic xmlns:pic="http://schemas.openxmlformats.org/drawingml/2006/picture">
+                  <pic:nvPicPr>
+                    <pic:cNvPr id="0" name="" descr=""/>
+                    <pic:cNvPicPr>
+                      <a:picLocks noChangeAspect="1" noChangeArrowheads="1"/>
+                    </pic:cNvPicPr>
+                  </pic:nvPicPr>
+                  <pic:blipFill>
+                    <a:blip r:embed="rId12" cstate="none"/>
+                    <a:srcRect/>
+                    <a:stretch>
+                      <a:fillRect/>
+                    </a:stretch>
+                  </pic:blipFill>
+                  <pic:spPr bwMode="auto">
+                    <a:xfrm>
+                      <a:off x="0" y="0"/>
+                      <a:ext cx="4095750" cy="3162300"/>
+                    </a:xfrm>
+                    <a:prstGeom prst="rect">
+                      <a:avLst/>
+                    </a:prstGeom>
+                  </pic:spPr>
+                </pic:pic>
+              </a:graphicData>
+            </a:graphic>
+          </wp:inline>
+        </w:drawing>
+      </w:r>
+    </w:p>
+    <w:p>
+      <w:pPr>
+        <w:spacing w:after="200"/>
+        <w:jc w:val="center"/>
+      </w:pPr>
+      <w:r>
+        <w:rPr>
+          <w:i/>
+          <w:iCs/>
+          <w:color w:val="595959"/>
+          <w:sz w:val="18"/>
+          <w:szCs w:val="18"/>
+        </w:rPr>
+        <w:t xml:space="preserve">Figura 5 – Sala de lavagem: porta de correr (vermelho) para a área descoberta; parede voltada para a ETE sem aberturas (slide 4).</w:t>
       </w:r>
     </w:p>
     <w:sectPr>
@@ -1577,6 +3637,7 @@
     <w:next w:val="Normal"/>
     <w:qFormat/>
     <w:pPr>
+      <w:keepNext/>
       <w:spacing w:after="120" w:before="300"/>
       <w:outlineLvl w:val="0"/>
     </w:pPr>
@@ -1586,6 +3647,24 @@
       <w:color w:val="00843D"/>
       <w:sz w:val="28"/>
       <w:szCs w:val="28"/>
+    </w:rPr>
+  </w:style>
+  <w:style w:type="paragraph" w:styleId="Heading2">
+    <w:name w:val="Heading 2"/>
+    <w:basedOn w:val="Normal"/>
+    <w:next w:val="Normal"/>
+    <w:qFormat/>
+    <w:pPr>
+      <w:keepNext/>
+      <w:spacing w:after="100" w:before="200"/>
+      <w:outlineLvl w:val="1"/>
+    </w:pPr>
+    <w:rPr>
+      <w:b/>
+      <w:bCs/>
+      <w:color w:val="404040"/>
+      <w:sz w:val="24"/>
+      <w:szCs w:val="24"/>
     </w:rPr>
   </w:style>
   <w:style w:type="paragraph" w:styleId="Title">

</xml_diff>

<commit_message>
Inclui preocupação sobre novas áreas pavimentadas como área construída
Co-Authored-By: Claude Opus 5.5 <noreply@anthropic.com>
Claude-Session: https://claude.ai/code/session_01VH5DHRWGjgZCrRg53kmxYL
</commit_message>
<xml_diff>
--- a/docs/Analise_Impacto_Layout_UBP_SFI.docx
+++ b/docs/Analise_Impacto_Layout_UBP_SFI.docx
@@ -524,6 +524,118 @@
     </w:p>
     <w:p>
       <w:pPr>
+        <w:pStyle w:val="Heading2"/>
+      </w:pPr>
+      <w:r>
+        <w:t xml:space="preserve">2.5 Novas áreas pavimentadas: podem ser consideradas área construída?</w:t>
+      </w:r>
+    </w:p>
+    <w:p>
+      <w:pPr>
+        <w:spacing w:after="120"/>
+      </w:pPr>
+      <w:r>
+        <w:t xml:space="preserve">O ajuste cria quatro áreas pavimentadas novas: a área descoberta da lavagem de uniformes, a área descoberta do refeitório, a faixa dos fundos com muro de contenção e, possivelmente, a faixa frontal de 3,00 m. Preocupa a possibilidade de a Prefeitura computar parte delas como área construída, principalmente as que são fechadas por muro, têm acesso só por dentro do prédio e uso ligado a ele (lavagem e refeitório), ou que venham a receber cobertura no futuro.</w:t>
+      </w:r>
+    </w:p>
+    <w:p>
+      <w:pPr>
+        <w:spacing w:after="120"/>
+      </w:pPr>
+      <w:r>
+        <w:t xml:space="preserve">Em geral, área descoberta pavimentada não entra no cálculo da área construída, mas reduz a área permeável. O que vale é o código de obras e a lei de uso do solo de São Francisco de Itabapoana. Se elas forem computadas, o impacto aparece em:</w:t>
+      </w:r>
+    </w:p>
+    <w:p>
+      <w:pPr>
+        <w:pStyle w:val="ListParagraph"/>
+        <w:numPr>
+          <w:ilvl w:val="0"/>
+          <w:numId w:val="2"/>
+        </w:numPr>
+        <w:spacing w:after="80"/>
+      </w:pPr>
+      <w:r>
+        <w:rPr>
+          <w:b/>
+          <w:bCs/>
+        </w:rPr>
+        <w:t xml:space="preserve">Índices urbanísticos: </w:t>
+      </w:r>
+      <w:r>
+        <w:t xml:space="preserve">área construída total, taxa de ocupação e coeficiente de aproveitamento, que podem ultrapassar o limite permitido.</w:t>
+      </w:r>
+    </w:p>
+    <w:p>
+      <w:pPr>
+        <w:pStyle w:val="ListParagraph"/>
+        <w:numPr>
+          <w:ilvl w:val="0"/>
+          <w:numId w:val="2"/>
+        </w:numPr>
+        <w:spacing w:after="80"/>
+      </w:pPr>
+      <w:r>
+        <w:rPr>
+          <w:b/>
+          <w:bCs/>
+        </w:rPr>
+        <w:t xml:space="preserve">Permeabilidade: </w:t>
+      </w:r>
+      <w:r>
+        <w:t xml:space="preserve">mesmo sem entrar na área construída, as quatro áreas reduzem a área permeável do lote.</w:t>
+      </w:r>
+    </w:p>
+    <w:p>
+      <w:pPr>
+        <w:pStyle w:val="ListParagraph"/>
+        <w:numPr>
+          <w:ilvl w:val="0"/>
+          <w:numId w:val="2"/>
+        </w:numPr>
+        <w:spacing w:after="80"/>
+      </w:pPr>
+      <w:r>
+        <w:rPr>
+          <w:b/>
+          <w:bCs/>
+        </w:rPr>
+        <w:t xml:space="preserve">Aprovação: </w:t>
+      </w:r>
+      <w:r>
+        <w:t xml:space="preserve">quadro de áreas do projeto, alvará, habite-se e taxas municipais precisam refletir as novas áreas, com risco de nova exigência da Prefeitura.</w:t>
+      </w:r>
+    </w:p>
+    <w:p>
+      <w:pPr>
+        <w:pStyle w:val="ListParagraph"/>
+        <w:numPr>
+          <w:ilvl w:val="0"/>
+          <w:numId w:val="2"/>
+        </w:numPr>
+        <w:spacing w:after="80"/>
+      </w:pPr>
+      <w:r>
+        <w:rPr>
+          <w:b/>
+          <w:bCs/>
+        </w:rPr>
+        <w:t xml:space="preserve">Custo: </w:t>
+      </w:r>
+      <w:r>
+        <w:t xml:space="preserve">pavimentação, drenagem e muros entram no orçamento como área de intervenção.</w:t>
+      </w:r>
+    </w:p>
+    <w:p>
+      <w:pPr>
+        <w:spacing w:after="120"/>
+      </w:pPr>
+      <w:r>
+        <w:t xml:space="preserve">Recomenda-se pedir à CBA B+G o quadro de áreas atualizado, com área construída, área pavimentada descoberta e área permeável, e confirmar com a Prefeitura como essas áreas serão computadas.</w:t>
+      </w:r>
+    </w:p>
+    <w:p>
+      <w:pPr>
         <w:pStyle w:val="Heading1"/>
       </w:pPr>
       <w:r>
@@ -2102,6 +2214,89 @@
                 <w:szCs w:val="19"/>
               </w:rPr>
               <w:t xml:space="preserve">O que representa a linha amarela nos fundos e na lateral do bloco de produção?</w:t>
+            </w:r>
+          </w:p>
+        </w:tc>
+        <w:tc>
+          <w:tcPr>
+            <w:tcW w:type="dxa" w:w="3726"/>
+            <w:tcBorders>
+              <w:top w:val="single" w:color="BFBFBF" w:sz="4"/>
+              <w:left w:val="single" w:color="BFBFBF" w:sz="4"/>
+              <w:bottom w:val="single" w:color="BFBFBF" w:sz="4"/>
+              <w:right w:val="single" w:color="BFBFBF" w:sz="4"/>
+            </w:tcBorders>
+            <w:tcMar>
+              <w:top w:type="dxa" w:w="60"/>
+              <w:left w:type="dxa" w:w="100"/>
+              <w:bottom w:type="dxa" w:w="60"/>
+              <w:right w:type="dxa" w:w="100"/>
+            </w:tcMar>
+          </w:tcPr>
+          <w:p>
+            <w:r>
+              <w:rPr>
+                <w:sz w:val="19"/>
+                <w:szCs w:val="19"/>
+              </w:rPr>
+              <w:t xml:space="preserve"/>
+            </w:r>
+          </w:p>
+        </w:tc>
+      </w:tr>
+      <w:tr>
+        <w:trPr>
+          <w:tblHeader w:val="false"/>
+        </w:trPr>
+        <w:tc>
+          <w:tcPr>
+            <w:tcW w:type="dxa" w:w="500"/>
+            <w:tcBorders>
+              <w:top w:val="single" w:color="BFBFBF" w:sz="4"/>
+              <w:left w:val="single" w:color="BFBFBF" w:sz="4"/>
+              <w:bottom w:val="single" w:color="BFBFBF" w:sz="4"/>
+              <w:right w:val="single" w:color="BFBFBF" w:sz="4"/>
+            </w:tcBorders>
+            <w:tcMar>
+              <w:top w:type="dxa" w:w="60"/>
+              <w:left w:type="dxa" w:w="100"/>
+              <w:bottom w:type="dxa" w:w="60"/>
+              <w:right w:type="dxa" w:w="100"/>
+            </w:tcMar>
+          </w:tcPr>
+          <w:p>
+            <w:r>
+              <w:rPr>
+                <w:sz w:val="19"/>
+                <w:szCs w:val="19"/>
+              </w:rPr>
+              <w:t xml:space="preserve">11</w:t>
+            </w:r>
+          </w:p>
+        </w:tc>
+        <w:tc>
+          <w:tcPr>
+            <w:tcW w:type="dxa" w:w="4800"/>
+            <w:tcBorders>
+              <w:top w:val="single" w:color="BFBFBF" w:sz="4"/>
+              <w:left w:val="single" w:color="BFBFBF" w:sz="4"/>
+              <w:bottom w:val="single" w:color="BFBFBF" w:sz="4"/>
+              <w:right w:val="single" w:color="BFBFBF" w:sz="4"/>
+            </w:tcBorders>
+            <w:tcMar>
+              <w:top w:type="dxa" w:w="60"/>
+              <w:left w:type="dxa" w:w="100"/>
+              <w:bottom w:type="dxa" w:w="60"/>
+              <w:right w:type="dxa" w:w="100"/>
+            </w:tcMar>
+          </w:tcPr>
+          <w:p>
+            <w:r>
+              <w:rPr>
+                <w:sz w:val="19"/>
+                <w:szCs w:val="19"/>
+              </w:rPr>
+              <w:t xml:space="preserve">As novas áreas pavimentadas (lavagem, refeitório, fundos e frente) serão computadas como área construída pela Prefeitura? Enviar o quadro de áreas atualizado (construída, pavimentada descoberta e permeável).</w:t>
             </w:r>
           </w:p>
         </w:tc>

</xml_diff>